<commit_message>
Revisão do cliente 01/07: destaque na data, página de palestrantes, correções de links
- Banner: data em tarja própria; CTA de patrocínio direto pro contato
- Números: cards em largura total, altura ajustada
- Palestrantes: Patrícia como mediadora, Airton Galinari incluído, foto da
  Angela Ruiz atualizada para corpo inteiro (Freepik/Magnific)
- Home: tabela de programação expandida com todos os painéis
- Ingressos/patrocínio: logo removida da foto do card; link real do Sympla
- Quem constrói: selo "80 anos" (placeholder em CSS)
- Localização: links de Waze/Maps corrigidos
- Rodapé: redes sociais, link da agência e CTA de patrocínio corrigidos
- Nova página palestrantes.html com grid completo (antes só âncora na home)

Co-Authored-By: Claude Sonnet 5 <noreply@anthropic.com>
</commit_message>
<xml_diff>
--- a/ajustes-site/REVISÃO SITE - FÓRUM DO AGRONEGÓCIO 2026.docx
+++ b/ajustes-site/REVISÃO SITE - FÓRUM DO AGRONEGÓCIO 2026.docx
@@ -15,7 +15,883 @@
           <w:bCs w:val="1"/>
           <w:rtl w:val="0"/>
         </w:rPr>
-        <w:t xml:space="preserve">REVISÃO SITE</w:t>
+        <w:t xml:space="preserve">REVISÃO SITE 01/07</w:t>
+      </w:r>
+    </w:p>
+    <w:p>
+      <w:pPr>
+        <w:numPr>
+          <w:ilvl w:val="0"/>
+          <w:numId w:val="2"/>
+        </w:numPr>
+        <w:spacing w:after="0" w:afterAutospacing="0"/>
+        <w:ind w:left="720" w:hanging="360"/>
+        <w:rPr>
+          <w:b w:val="1"/>
+          <w:bCs w:val="1"/>
+          <w:u w:val="none"/>
+        </w:rPr>
+      </w:pPr>
+      <w:r>
+        <w:rPr>
+          <w:b w:val="1"/>
+          <w:bCs w:val="1"/>
+          <w:rtl w:val="0"/>
+        </w:rPr>
+        <w:t xml:space="preserve">Banner Principal</w:t>
+      </w:r>
+    </w:p>
+    <w:p>
+      <w:pPr>
+        <w:numPr>
+          <w:ilvl w:val="0"/>
+          <w:numId w:val="6"/>
+        </w:numPr>
+        <w:spacing w:after="240" w:before="0" w:beforeAutospacing="0" w:lineRule="auto"/>
+        <w:ind w:left="720" w:hanging="360"/>
+        <w:rPr>
+          <w:u w:val="none"/>
+        </w:rPr>
+      </w:pPr>
+      <w:r>
+        <w:rPr>
+          <w:rtl w:val="0"/>
+        </w:rPr>
+        <w:t xml:space="preserve">Ao ver o banner pronto, acreditamos que a data merece um pouco mais de destaque. Vocês conseguem pensar em alguma possibilidade?</w:t>
+      </w:r>
+    </w:p>
+    <w:p>
+      <w:pPr>
+        <w:spacing w:after="240" w:before="240" w:lineRule="auto"/>
+        <w:rPr/>
+      </w:pPr>
+      <w:r>
+        <w:rPr>
+          <w:rtl w:val="0"/>
+        </w:rPr>
+        <w:t xml:space="preserve">Gostamos desta referência, não necessariamente para reproduzi-la, mas como inspiração para uma solução que valorize mais a data. Talvez com um balão, uma tarja ou outro elemento gráfico que ajude a dar mais evidência a essa informação.</w:t>
+      </w:r>
+    </w:p>
+    <w:p>
+      <w:pPr>
+        <w:rPr/>
+      </w:pPr>
+      <w:r>
+        <w:rPr/>
+        <w:drawing>
+          <wp:inline distB="114300" distT="114300" distL="114300" distR="114300">
+            <wp:extent cx="3424238" cy="1001106"/>
+            <wp:effectExtent b="0" l="0" r="0" t="0"/>
+            <wp:docPr id="3" name="image1.png"/>
+            <a:graphic>
+              <a:graphicData uri="http://schemas.openxmlformats.org/drawingml/2006/picture">
+                <pic:pic>
+                  <pic:nvPicPr>
+                    <pic:cNvPr id="0" name="image1.png"/>
+                    <pic:cNvPicPr preferRelativeResize="0"/>
+                  </pic:nvPicPr>
+                  <pic:blipFill>
+                    <a:blip r:embed="rId6"/>
+                    <a:srcRect b="0" l="0" r="0" t="0"/>
+                    <a:stretch>
+                      <a:fillRect/>
+                    </a:stretch>
+                  </pic:blipFill>
+                  <pic:spPr>
+                    <a:xfrm>
+                      <a:off x="0" y="0"/>
+                      <a:ext cx="3424238" cy="1001106"/>
+                    </a:xfrm>
+                    <a:prstGeom prst="rect"/>
+                    <a:ln/>
+                  </pic:spPr>
+                </pic:pic>
+              </a:graphicData>
+            </a:graphic>
+          </wp:inline>
+        </w:drawing>
+      </w:r>
+      <w:r>
+        <w:rPr>
+          <w:rtl w:val="0"/>
+        </w:rPr>
+      </w:r>
+    </w:p>
+    <w:p>
+      <w:pPr>
+        <w:rPr/>
+      </w:pPr>
+      <w:r>
+        <w:rPr>
+          <w:rtl w:val="0"/>
+        </w:rPr>
+      </w:r>
+    </w:p>
+    <w:p>
+      <w:pPr>
+        <w:numPr>
+          <w:ilvl w:val="0"/>
+          <w:numId w:val="22"/>
+        </w:numPr>
+        <w:ind w:left="720" w:hanging="360"/>
+        <w:rPr>
+          <w:u w:val="none"/>
+        </w:rPr>
+      </w:pPr>
+      <w:r>
+        <w:rPr>
+          <w:rtl w:val="0"/>
+        </w:rPr>
+        <w:t xml:space="preserve">botão de “seja patrocinador” deve ser direcionado já para a página de contato</w:t>
+      </w:r>
+    </w:p>
+    <w:p>
+      <w:pPr>
+        <w:rPr>
+          <w:b w:val="1"/>
+          <w:bCs w:val="1"/>
+        </w:rPr>
+      </w:pPr>
+      <w:r>
+        <w:rPr>
+          <w:rtl w:val="0"/>
+        </w:rPr>
+      </w:r>
+    </w:p>
+    <w:p>
+      <w:pPr>
+        <w:numPr>
+          <w:ilvl w:val="0"/>
+          <w:numId w:val="2"/>
+        </w:numPr>
+        <w:ind w:left="720" w:hanging="360"/>
+        <w:rPr>
+          <w:b w:val="1"/>
+          <w:bCs w:val="1"/>
+          <w:u w:val="none"/>
+        </w:rPr>
+      </w:pPr>
+      <w:r>
+        <w:rPr>
+          <w:b w:val="1"/>
+          <w:bCs w:val="1"/>
+          <w:rtl w:val="0"/>
+        </w:rPr>
+        <w:t xml:space="preserve">Fórum em Números</w:t>
+      </w:r>
+    </w:p>
+    <w:p>
+      <w:pPr>
+        <w:ind w:left="0" w:firstLine="0"/>
+        <w:rPr/>
+      </w:pPr>
+      <w:r>
+        <w:rPr>
+          <w:rtl w:val="0"/>
+        </w:rPr>
+        <w:t xml:space="preserve">Ainda acreditamos que os blocos estão muito grandes, deixando a seção muito extensa. Podemos diminuir um pouco dos quadrados?</w:t>
+      </w:r>
+    </w:p>
+    <w:p>
+      <w:pPr>
+        <w:ind w:left="0" w:firstLine="0"/>
+        <w:rPr>
+          <w:b w:val="1"/>
+          <w:bCs w:val="1"/>
+        </w:rPr>
+      </w:pPr>
+      <w:r>
+        <w:rPr>
+          <w:rtl w:val="0"/>
+        </w:rPr>
+      </w:r>
+    </w:p>
+    <w:p>
+      <w:pPr>
+        <w:numPr>
+          <w:ilvl w:val="0"/>
+          <w:numId w:val="2"/>
+        </w:numPr>
+        <w:ind w:left="720" w:hanging="360"/>
+        <w:rPr>
+          <w:b w:val="1"/>
+          <w:bCs w:val="1"/>
+          <w:u w:val="none"/>
+        </w:rPr>
+      </w:pPr>
+      <w:r>
+        <w:rPr>
+          <w:b w:val="1"/>
+          <w:bCs w:val="1"/>
+          <w:rtl w:val="0"/>
+        </w:rPr>
+        <w:t xml:space="preserve">Palestrantes</w:t>
+      </w:r>
+    </w:p>
+    <w:p>
+      <w:pPr>
+        <w:numPr>
+          <w:ilvl w:val="0"/>
+          <w:numId w:val="1"/>
+        </w:numPr>
+        <w:ind w:left="720" w:hanging="360"/>
+        <w:rPr>
+          <w:u w:val="none"/>
+        </w:rPr>
+      </w:pPr>
+      <w:r>
+        <w:rPr>
+          <w:rtl w:val="0"/>
+        </w:rPr>
+        <w:t xml:space="preserve">Incluir “mediadora” no quadro da Patrícia e logo</w:t>
+      </w:r>
+    </w:p>
+    <w:p>
+      <w:pPr>
+        <w:numPr>
+          <w:ilvl w:val="0"/>
+          <w:numId w:val="1"/>
+        </w:numPr>
+        <w:ind w:left="720" w:hanging="360"/>
+        <w:rPr>
+          <w:u w:val="none"/>
+        </w:rPr>
+      </w:pPr>
+      <w:r>
+        <w:rPr>
+          <w:rtl w:val="0"/>
+        </w:rPr>
+        <w:t xml:space="preserve">incluir logo do Fernando Lopes</w:t>
+      </w:r>
+    </w:p>
+    <w:p>
+      <w:pPr>
+        <w:numPr>
+          <w:ilvl w:val="0"/>
+          <w:numId w:val="1"/>
+        </w:numPr>
+        <w:ind w:left="720" w:hanging="360"/>
+        <w:rPr>
+          <w:u w:val="none"/>
+        </w:rPr>
+      </w:pPr>
+      <w:r>
+        <w:rPr>
+          <w:rtl w:val="0"/>
+        </w:rPr>
+        <w:t xml:space="preserve">incluir painelista Airton Galinari </w:t>
+      </w:r>
+    </w:p>
+    <w:p>
+      <w:pPr>
+        <w:rPr/>
+      </w:pPr>
+      <w:r>
+        <w:rPr>
+          <w:rtl w:val="0"/>
+        </w:rPr>
+      </w:r>
+    </w:p>
+    <w:p>
+      <w:pPr>
+        <w:numPr>
+          <w:ilvl w:val="0"/>
+          <w:numId w:val="2"/>
+        </w:numPr>
+        <w:ind w:left="720" w:hanging="360"/>
+        <w:rPr>
+          <w:b w:val="1"/>
+          <w:bCs w:val="1"/>
+          <w:u w:val="none"/>
+        </w:rPr>
+      </w:pPr>
+      <w:r>
+        <w:rPr>
+          <w:b w:val="1"/>
+          <w:bCs w:val="1"/>
+          <w:rtl w:val="0"/>
+        </w:rPr>
+        <w:t xml:space="preserve">Incluir todos os horários e painéis</w:t>
+      </w:r>
+    </w:p>
+    <w:p>
+      <w:pPr>
+        <w:ind w:left="720" w:firstLine="0"/>
+        <w:rPr/>
+      </w:pPr>
+      <w:r>
+        <w:rPr/>
+        <w:drawing>
+          <wp:inline distB="114300" distT="114300" distL="114300" distR="114300">
+            <wp:extent cx="4186238" cy="1787148"/>
+            <wp:effectExtent b="0" l="0" r="0" t="0"/>
+            <wp:docPr id="4" name="image3.png"/>
+            <a:graphic>
+              <a:graphicData uri="http://schemas.openxmlformats.org/drawingml/2006/picture">
+                <pic:pic>
+                  <pic:nvPicPr>
+                    <pic:cNvPr id="0" name="image3.png"/>
+                    <pic:cNvPicPr preferRelativeResize="0"/>
+                  </pic:nvPicPr>
+                  <pic:blipFill>
+                    <a:blip r:embed="rId7"/>
+                    <a:srcRect b="0" l="0" r="0" t="0"/>
+                    <a:stretch>
+                      <a:fillRect/>
+                    </a:stretch>
+                  </pic:blipFill>
+                  <pic:spPr>
+                    <a:xfrm>
+                      <a:off x="0" y="0"/>
+                      <a:ext cx="4186238" cy="1787148"/>
+                    </a:xfrm>
+                    <a:prstGeom prst="rect"/>
+                    <a:ln/>
+                  </pic:spPr>
+                </pic:pic>
+              </a:graphicData>
+            </a:graphic>
+          </wp:inline>
+        </w:drawing>
+      </w:r>
+      <w:r>
+        <w:rPr>
+          <w:rtl w:val="0"/>
+        </w:rPr>
+      </w:r>
+    </w:p>
+    <w:p>
+      <w:pPr>
+        <w:ind w:left="0" w:firstLine="0"/>
+        <w:rPr>
+          <w:b w:val="1"/>
+          <w:bCs w:val="1"/>
+        </w:rPr>
+      </w:pPr>
+      <w:r>
+        <w:rPr>
+          <w:rtl w:val="0"/>
+        </w:rPr>
+      </w:r>
+    </w:p>
+    <w:p>
+      <w:pPr>
+        <w:numPr>
+          <w:ilvl w:val="0"/>
+          <w:numId w:val="2"/>
+        </w:numPr>
+        <w:ind w:left="720" w:hanging="360"/>
+        <w:rPr>
+          <w:b w:val="1"/>
+          <w:bCs w:val="1"/>
+        </w:rPr>
+      </w:pPr>
+      <w:r>
+        <w:rPr>
+          <w:b w:val="1"/>
+          <w:bCs w:val="1"/>
+          <w:rtl w:val="0"/>
+        </w:rPr>
+        <w:t xml:space="preserve">Ingressos e patrocínios</w:t>
+      </w:r>
+    </w:p>
+    <w:p>
+      <w:pPr>
+        <w:rPr/>
+      </w:pPr>
+      <w:r>
+        <w:rPr>
+          <w:rtl w:val="0"/>
+        </w:rPr>
+        <w:t xml:space="preserve">tirar a logo da imagem:</w:t>
+      </w:r>
+    </w:p>
+    <w:p>
+      <w:pPr>
+        <w:rPr/>
+      </w:pPr>
+      <w:r>
+        <w:rPr/>
+        <w:drawing>
+          <wp:inline distB="114300" distT="114300" distL="114300" distR="114300">
+            <wp:extent cx="1862138" cy="1115178"/>
+            <wp:effectExtent b="0" l="0" r="0" t="0"/>
+            <wp:docPr id="1" name="image6.png"/>
+            <a:graphic>
+              <a:graphicData uri="http://schemas.openxmlformats.org/drawingml/2006/picture">
+                <pic:pic>
+                  <pic:nvPicPr>
+                    <pic:cNvPr id="0" name="image6.png"/>
+                    <pic:cNvPicPr preferRelativeResize="0"/>
+                  </pic:nvPicPr>
+                  <pic:blipFill>
+                    <a:blip r:embed="rId8"/>
+                    <a:srcRect b="0" l="0" r="0" t="0"/>
+                    <a:stretch>
+                      <a:fillRect/>
+                    </a:stretch>
+                  </pic:blipFill>
+                  <pic:spPr>
+                    <a:xfrm>
+                      <a:off x="0" y="0"/>
+                      <a:ext cx="1862138" cy="1115178"/>
+                    </a:xfrm>
+                    <a:prstGeom prst="rect"/>
+                    <a:ln/>
+                  </pic:spPr>
+                </pic:pic>
+              </a:graphicData>
+            </a:graphic>
+          </wp:inline>
+        </w:drawing>
+      </w:r>
+      <w:r>
+        <w:rPr>
+          <w:rtl w:val="0"/>
+        </w:rPr>
+      </w:r>
+    </w:p>
+    <w:p>
+      <w:pPr>
+        <w:rPr>
+          <w:b w:val="1"/>
+          <w:bCs w:val="1"/>
+        </w:rPr>
+      </w:pPr>
+      <w:r>
+        <w:rPr>
+          <w:rtl w:val="0"/>
+        </w:rPr>
+      </w:r>
+    </w:p>
+    <w:p>
+      <w:pPr>
+        <w:numPr>
+          <w:ilvl w:val="0"/>
+          <w:numId w:val="2"/>
+        </w:numPr>
+        <w:ind w:left="720" w:hanging="360"/>
+        <w:rPr>
+          <w:b w:val="1"/>
+          <w:bCs w:val="1"/>
+          <w:u w:val="none"/>
+        </w:rPr>
+      </w:pPr>
+      <w:r>
+        <w:rPr>
+          <w:b w:val="1"/>
+          <w:bCs w:val="1"/>
+          <w:rtl w:val="0"/>
+        </w:rPr>
+        <w:t xml:space="preserve">Quem constrói o fórum</w:t>
+      </w:r>
+    </w:p>
+    <w:p>
+      <w:pPr>
+        <w:numPr>
+          <w:ilvl w:val="0"/>
+          <w:numId w:val="17"/>
+        </w:numPr>
+        <w:ind w:left="720" w:hanging="360"/>
+        <w:rPr>
+          <w:u w:val="none"/>
+        </w:rPr>
+      </w:pPr>
+      <w:r>
+        <w:rPr>
+          <w:rtl w:val="0"/>
+        </w:rPr>
+        <w:t xml:space="preserve">atualizar a logo da rural para selo de 80 anos</w:t>
+      </w:r>
+    </w:p>
+    <w:p>
+      <w:pPr>
+        <w:rPr>
+          <w:b w:val="1"/>
+          <w:bCs w:val="1"/>
+        </w:rPr>
+      </w:pPr>
+      <w:r>
+        <w:rPr>
+          <w:rtl w:val="0"/>
+        </w:rPr>
+      </w:r>
+    </w:p>
+    <w:p>
+      <w:pPr>
+        <w:numPr>
+          <w:ilvl w:val="0"/>
+          <w:numId w:val="2"/>
+        </w:numPr>
+        <w:ind w:left="720" w:hanging="360"/>
+        <w:rPr>
+          <w:b w:val="1"/>
+          <w:bCs w:val="1"/>
+        </w:rPr>
+      </w:pPr>
+      <w:r>
+        <w:rPr>
+          <w:b w:val="1"/>
+          <w:bCs w:val="1"/>
+          <w:rtl w:val="0"/>
+        </w:rPr>
+        <w:t xml:space="preserve">Localização</w:t>
+      </w:r>
+    </w:p>
+    <w:p>
+      <w:pPr>
+        <w:rPr/>
+      </w:pPr>
+      <w:r>
+        <w:rPr>
+          <w:rtl w:val="0"/>
+        </w:rPr>
+        <w:t xml:space="preserve">os links são direcionados para o endereço? pois aqui só abre sem indicar o local</w:t>
+      </w:r>
+    </w:p>
+    <w:p>
+      <w:pPr>
+        <w:rPr>
+          <w:b w:val="1"/>
+          <w:bCs w:val="1"/>
+        </w:rPr>
+      </w:pPr>
+      <w:r>
+        <w:rPr>
+          <w:rtl w:val="0"/>
+        </w:rPr>
+      </w:r>
+    </w:p>
+    <w:p>
+      <w:pPr>
+        <w:numPr>
+          <w:ilvl w:val="0"/>
+          <w:numId w:val="2"/>
+        </w:numPr>
+        <w:ind w:left="720" w:hanging="360"/>
+        <w:rPr>
+          <w:b w:val="1"/>
+          <w:bCs w:val="1"/>
+        </w:rPr>
+      </w:pPr>
+      <w:r>
+        <w:rPr>
+          <w:b w:val="1"/>
+          <w:bCs w:val="1"/>
+          <w:rtl w:val="0"/>
+        </w:rPr>
+        <w:t xml:space="preserve">Rodapé</w:t>
+      </w:r>
+    </w:p>
+    <w:p>
+      <w:pPr>
+        <w:numPr>
+          <w:ilvl w:val="0"/>
+          <w:numId w:val="24"/>
+        </w:numPr>
+        <w:ind w:left="720" w:hanging="360"/>
+        <w:rPr>
+          <w:u w:val="none"/>
+        </w:rPr>
+      </w:pPr>
+      <w:r>
+        <w:rPr>
+          <w:rtl w:val="0"/>
+        </w:rPr>
+        <w:t xml:space="preserve">links estão incorretos, atualizar:</w:t>
+      </w:r>
+    </w:p>
+    <w:p>
+      <w:pPr>
+        <w:rPr/>
+      </w:pPr>
+      <w:hyperlink r:id="rId9">
+        <w:r>
+          <w:rPr>
+            <w:color w:val="1155cc"/>
+            <w:u w:val="single"/>
+            <w:rtl w:val="0"/>
+          </w:rPr>
+          <w:t xml:space="preserve">https://www.instagram.com/srp_oficial/</w:t>
+        </w:r>
+      </w:hyperlink>
+      <w:r>
+        <w:rPr>
+          <w:rtl w:val="0"/>
+        </w:rPr>
+      </w:r>
+    </w:p>
+    <w:p>
+      <w:pPr>
+        <w:rPr/>
+      </w:pPr>
+      <w:hyperlink r:id="rId10">
+        <w:r>
+          <w:rPr>
+            <w:color w:val="1155cc"/>
+            <w:u w:val="single"/>
+            <w:rtl w:val="0"/>
+          </w:rPr>
+          <w:t xml:space="preserve">https://www.facebook.com/sociedaderuralpr?locale=pt_BR</w:t>
+        </w:r>
+      </w:hyperlink>
+      <w:r>
+        <w:rPr>
+          <w:rtl w:val="0"/>
+        </w:rPr>
+      </w:r>
+    </w:p>
+    <w:p>
+      <w:pPr>
+        <w:rPr/>
+      </w:pPr>
+      <w:hyperlink r:id="rId11">
+        <w:r>
+          <w:rPr>
+            <w:color w:val="1155cc"/>
+            <w:u w:val="single"/>
+            <w:rtl w:val="0"/>
+          </w:rPr>
+          <w:t xml:space="preserve">https://br.linkedin.com/company/sociedaderuralpr</w:t>
+        </w:r>
+      </w:hyperlink>
+      <w:r>
+        <w:rPr>
+          <w:rtl w:val="0"/>
+        </w:rPr>
+      </w:r>
+    </w:p>
+    <w:p>
+      <w:pPr>
+        <w:rPr/>
+      </w:pPr>
+      <w:r>
+        <w:rPr>
+          <w:rtl w:val="0"/>
+        </w:rPr>
+      </w:r>
+    </w:p>
+    <w:p>
+      <w:pPr>
+        <w:numPr>
+          <w:ilvl w:val="0"/>
+          <w:numId w:val="26"/>
+        </w:numPr>
+        <w:ind w:left="720" w:hanging="360"/>
+      </w:pPr>
+      <w:r>
+        <w:rPr>
+          <w:rtl w:val="0"/>
+        </w:rPr>
+        <w:t xml:space="preserve">botão de “patrocínio” deve ser direcionado já para a página de contato</w:t>
+      </w:r>
+    </w:p>
+    <w:p>
+      <w:pPr>
+        <w:numPr>
+          <w:ilvl w:val="0"/>
+          <w:numId w:val="26"/>
+        </w:numPr>
+        <w:ind w:left="720" w:hanging="360"/>
+        <w:rPr>
+          <w:u w:val="none"/>
+        </w:rPr>
+      </w:pPr>
+      <w:r>
+        <w:rPr>
+          <w:rtl w:val="0"/>
+        </w:rPr>
+        <w:t xml:space="preserve">link da agência está direcionando para uma página não encontrada</w:t>
+      </w:r>
+    </w:p>
+    <w:p>
+      <w:pPr>
+        <w:rPr/>
+      </w:pPr>
+      <w:r>
+        <w:rPr>
+          <w:rtl w:val="0"/>
+        </w:rPr>
+      </w:r>
+    </w:p>
+    <w:p>
+      <w:pPr>
+        <w:rPr>
+          <w:b w:val="1"/>
+          <w:bCs w:val="1"/>
+        </w:rPr>
+      </w:pPr>
+      <w:r>
+        <w:rPr>
+          <w:rtl w:val="0"/>
+        </w:rPr>
+      </w:r>
+    </w:p>
+    <w:p>
+      <w:pPr>
+        <w:numPr>
+          <w:ilvl w:val="0"/>
+          <w:numId w:val="2"/>
+        </w:numPr>
+        <w:ind w:left="720" w:hanging="360"/>
+        <w:rPr>
+          <w:b w:val="1"/>
+          <w:bCs w:val="1"/>
+        </w:rPr>
+      </w:pPr>
+      <w:r>
+        <w:rPr>
+          <w:b w:val="1"/>
+          <w:bCs w:val="1"/>
+          <w:rtl w:val="0"/>
+        </w:rPr>
+        <w:t xml:space="preserve">Menu Palestrantes</w:t>
+      </w:r>
+    </w:p>
+    <w:p>
+      <w:pPr>
+        <w:ind w:left="0" w:firstLine="0"/>
+        <w:rPr/>
+      </w:pPr>
+      <w:r>
+        <w:rPr>
+          <w:rtl w:val="0"/>
+        </w:rPr>
+        <w:t xml:space="preserve">Podemos criar uma aba exclusiva para palestrantes, assim como o menu da programação. Nessa aba, colocamos todos os palestrantes de forma que preencha a página inteira, e não rotativo como na home principal</w:t>
+      </w:r>
+    </w:p>
+    <w:p>
+      <w:pPr>
+        <w:rPr/>
+      </w:pPr>
+      <w:r>
+        <w:rPr>
+          <w:rtl w:val="0"/>
+        </w:rPr>
+      </w:r>
+    </w:p>
+    <w:p>
+      <w:pPr>
+        <w:numPr>
+          <w:ilvl w:val="0"/>
+          <w:numId w:val="2"/>
+        </w:numPr>
+        <w:ind w:left="720" w:hanging="360"/>
+        <w:rPr>
+          <w:b w:val="1"/>
+          <w:bCs w:val="1"/>
+        </w:rPr>
+      </w:pPr>
+      <w:r>
+        <w:rPr>
+          <w:b w:val="1"/>
+          <w:bCs w:val="1"/>
+          <w:rtl w:val="0"/>
+        </w:rPr>
+        <w:t xml:space="preserve">Menu Ingressos</w:t>
+      </w:r>
+    </w:p>
+    <w:p>
+      <w:pPr>
+        <w:numPr>
+          <w:ilvl w:val="0"/>
+          <w:numId w:val="5"/>
+        </w:numPr>
+        <w:ind w:left="720" w:hanging="360"/>
+        <w:rPr>
+          <w:u w:val="none"/>
+        </w:rPr>
+      </w:pPr>
+      <w:r>
+        <w:rPr>
+          <w:rtl w:val="0"/>
+        </w:rPr>
+        <w:t xml:space="preserve">já podemos incluir o link do sympla:</w:t>
+      </w:r>
+    </w:p>
+    <w:p>
+      <w:pPr>
+        <w:rPr/>
+      </w:pPr>
+      <w:hyperlink r:id="rId12">
+        <w:r>
+          <w:rPr>
+            <w:color w:val="1155cc"/>
+            <w:u w:val="single"/>
+            <w:rtl w:val="0"/>
+          </w:rPr>
+          <w:t xml:space="preserve">https://www.sympla.com.br/evento/forum-do-agronegocio-2026/3484384</w:t>
+        </w:r>
+      </w:hyperlink>
+      <w:r>
+        <w:rPr>
+          <w:rtl w:val="0"/>
+        </w:rPr>
+      </w:r>
+    </w:p>
+    <w:p>
+      <w:pPr>
+        <w:rPr/>
+      </w:pPr>
+      <w:r>
+        <w:rPr>
+          <w:rtl w:val="0"/>
+        </w:rPr>
+      </w:r>
+    </w:p>
+    <w:p>
+      <w:pPr>
+        <w:rPr>
+          <w:b w:val="1"/>
+          <w:bCs w:val="1"/>
+        </w:rPr>
+      </w:pPr>
+      <w:r>
+        <w:rPr>
+          <w:rtl w:val="0"/>
+        </w:rPr>
+      </w:r>
+    </w:p>
+    <w:p>
+      <w:pPr>
+        <w:rPr>
+          <w:b w:val="1"/>
+          <w:bCs w:val="1"/>
+        </w:rPr>
+      </w:pPr>
+      <w:r>
+        <w:rPr>
+          <w:rtl w:val="0"/>
+        </w:rPr>
+      </w:r>
+    </w:p>
+    <w:p>
+      <w:pPr>
+        <w:rPr>
+          <w:b w:val="1"/>
+          <w:bCs w:val="1"/>
+        </w:rPr>
+      </w:pPr>
+      <w:r>
+        <w:rPr>
+          <w:rtl w:val="0"/>
+        </w:rPr>
+      </w:r>
+    </w:p>
+    <w:p>
+      <w:pPr>
+        <w:rPr>
+          <w:b w:val="1"/>
+          <w:bCs w:val="1"/>
+        </w:rPr>
+      </w:pPr>
+      <w:r>
+        <w:rPr>
+          <w:b w:val="1"/>
+          <w:bCs w:val="1"/>
+          <w:rtl w:val="0"/>
+        </w:rPr>
+        <w:t xml:space="preserve">REVISÃO SITE 25/06</w:t>
       </w:r>
     </w:p>
     <w:p>
@@ -51,7 +927,7 @@
       <w:pPr>
         <w:rPr/>
       </w:pPr>
-      <w:hyperlink r:id="rId6">
+      <w:hyperlink r:id="rId13">
         <w:r>
           <w:rPr>
             <w:color w:val="1155cc"/>
@@ -71,7 +947,7 @@
       <w:pPr>
         <w:numPr>
           <w:ilvl w:val="0"/>
-          <w:numId w:val="14"/>
+          <w:numId w:val="19"/>
         </w:numPr>
         <w:spacing w:after="240" w:before="240" w:lineRule="auto"/>
         <w:ind w:left="720" w:hanging="360"/>
@@ -113,7 +989,7 @@
         </w:rPr>
         <w:t xml:space="preserve">Como referência de estética e comportamento, gostamos deste modelo:</w:t>
       </w:r>
-      <w:hyperlink r:id="rId7">
+      <w:hyperlink r:id="rId14">
         <w:r>
           <w:rPr>
             <w:rtl w:val="0"/>
@@ -121,7 +997,7 @@
           <w:t xml:space="preserve"> </w:t>
         </w:r>
       </w:hyperlink>
-      <w:hyperlink r:id="rId8">
+      <w:hyperlink r:id="rId15">
         <w:r>
           <w:rPr>
             <w:color w:val="1155cc"/>
@@ -168,7 +1044,7 @@
       <w:pPr>
         <w:numPr>
           <w:ilvl w:val="0"/>
-          <w:numId w:val="9"/>
+          <w:numId w:val="13"/>
         </w:numPr>
         <w:spacing w:after="0" w:afterAutospacing="0" w:before="240" w:lineRule="auto"/>
         <w:ind w:left="720" w:hanging="360"/>
@@ -192,7 +1068,7 @@
       <w:pPr>
         <w:numPr>
           <w:ilvl w:val="0"/>
-          <w:numId w:val="9"/>
+          <w:numId w:val="13"/>
         </w:numPr>
         <w:spacing w:after="0" w:afterAutospacing="0" w:before="0" w:beforeAutospacing="0" w:lineRule="auto"/>
         <w:ind w:left="720" w:hanging="360"/>
@@ -216,7 +1092,7 @@
       <w:pPr>
         <w:numPr>
           <w:ilvl w:val="0"/>
-          <w:numId w:val="9"/>
+          <w:numId w:val="13"/>
         </w:numPr>
         <w:spacing w:after="240" w:before="0" w:beforeAutospacing="0" w:lineRule="auto"/>
         <w:ind w:left="720" w:hanging="360"/>
@@ -257,7 +1133,7 @@
         <w:keepLines w:val="0"/>
         <w:numPr>
           <w:ilvl w:val="0"/>
-          <w:numId w:val="14"/>
+          <w:numId w:val="19"/>
         </w:numPr>
         <w:spacing w:after="0" w:afterAutospacing="0" w:before="280" w:lineRule="auto"/>
         <w:ind w:left="720" w:hanging="360"/>
@@ -288,7 +1164,7 @@
       <w:pPr>
         <w:numPr>
           <w:ilvl w:val="0"/>
-          <w:numId w:val="15"/>
+          <w:numId w:val="20"/>
         </w:numPr>
         <w:spacing w:after="0" w:afterAutospacing="0" w:before="0" w:beforeAutospacing="0" w:lineRule="auto"/>
         <w:ind w:left="720" w:hanging="360"/>
@@ -300,7 +1176,7 @@
         <w:t xml:space="preserve">Substituir o vídeo atual:</w:t>
         <w:br w:type="textWrapping"/>
       </w:r>
-      <w:hyperlink r:id="rId9">
+      <w:hyperlink r:id="rId16">
         <w:r>
           <w:rPr>
             <w:color w:val="1155cc"/>
@@ -320,7 +1196,7 @@
       <w:pPr>
         <w:numPr>
           <w:ilvl w:val="0"/>
-          <w:numId w:val="15"/>
+          <w:numId w:val="20"/>
         </w:numPr>
         <w:spacing w:after="0" w:afterAutospacing="0" w:before="0" w:beforeAutospacing="0" w:lineRule="auto"/>
         <w:ind w:left="720" w:hanging="360"/>
@@ -336,7 +1212,7 @@
       <w:pPr>
         <w:numPr>
           <w:ilvl w:val="0"/>
-          <w:numId w:val="15"/>
+          <w:numId w:val="20"/>
         </w:numPr>
         <w:spacing w:after="0" w:afterAutospacing="0" w:before="0" w:beforeAutospacing="0" w:lineRule="auto"/>
         <w:ind w:left="720" w:hanging="360"/>
@@ -353,7 +1229,7 @@
       <w:pPr>
         <w:numPr>
           <w:ilvl w:val="0"/>
-          <w:numId w:val="15"/>
+          <w:numId w:val="20"/>
         </w:numPr>
         <w:spacing w:after="0" w:afterAutospacing="0" w:before="0" w:beforeAutospacing="0" w:lineRule="auto"/>
         <w:ind w:left="720" w:hanging="360"/>
@@ -370,7 +1246,7 @@
       <w:pPr>
         <w:numPr>
           <w:ilvl w:val="0"/>
-          <w:numId w:val="15"/>
+          <w:numId w:val="20"/>
         </w:numPr>
         <w:spacing w:after="0" w:afterAutospacing="0" w:before="0" w:beforeAutospacing="0" w:lineRule="auto"/>
         <w:ind w:left="720" w:hanging="360"/>
@@ -387,7 +1263,7 @@
       <w:pPr>
         <w:numPr>
           <w:ilvl w:val="0"/>
-          <w:numId w:val="15"/>
+          <w:numId w:val="20"/>
         </w:numPr>
         <w:spacing w:after="240" w:before="0" w:beforeAutospacing="0" w:lineRule="auto"/>
         <w:ind w:left="720" w:hanging="360"/>
@@ -417,7 +1293,7 @@
         <w:keepLines w:val="0"/>
         <w:numPr>
           <w:ilvl w:val="0"/>
-          <w:numId w:val="14"/>
+          <w:numId w:val="19"/>
         </w:numPr>
         <w:spacing w:after="0" w:afterAutospacing="0" w:before="280" w:lineRule="auto"/>
         <w:ind w:left="720" w:hanging="360"/>
@@ -448,7 +1324,7 @@
       <w:pPr>
         <w:numPr>
           <w:ilvl w:val="0"/>
-          <w:numId w:val="2"/>
+          <w:numId w:val="4"/>
         </w:numPr>
         <w:spacing w:after="0" w:afterAutospacing="0" w:before="0" w:beforeAutospacing="0" w:lineRule="auto"/>
         <w:ind w:left="720" w:hanging="360"/>
@@ -464,7 +1340,7 @@
       <w:pPr>
         <w:numPr>
           <w:ilvl w:val="0"/>
-          <w:numId w:val="2"/>
+          <w:numId w:val="4"/>
         </w:numPr>
         <w:spacing w:after="0" w:afterAutospacing="0" w:before="0" w:beforeAutospacing="0" w:lineRule="auto"/>
         <w:ind w:left="720" w:hanging="360"/>
@@ -491,7 +1367,7 @@
       <w:pPr>
         <w:numPr>
           <w:ilvl w:val="0"/>
-          <w:numId w:val="2"/>
+          <w:numId w:val="4"/>
         </w:numPr>
         <w:spacing w:after="0" w:afterAutospacing="0" w:before="0" w:beforeAutospacing="0" w:lineRule="auto"/>
         <w:ind w:left="720" w:hanging="360"/>
@@ -508,7 +1384,7 @@
       <w:pPr>
         <w:numPr>
           <w:ilvl w:val="0"/>
-          <w:numId w:val="2"/>
+          <w:numId w:val="4"/>
         </w:numPr>
         <w:spacing w:after="0" w:afterAutospacing="0" w:before="0" w:beforeAutospacing="0" w:lineRule="auto"/>
         <w:ind w:left="720" w:hanging="360"/>
@@ -534,7 +1410,7 @@
       <w:pPr>
         <w:numPr>
           <w:ilvl w:val="0"/>
-          <w:numId w:val="2"/>
+          <w:numId w:val="4"/>
         </w:numPr>
         <w:spacing w:after="0" w:afterAutospacing="0" w:before="0" w:beforeAutospacing="0" w:lineRule="auto"/>
         <w:ind w:left="720" w:hanging="360"/>
@@ -560,7 +1436,7 @@
       <w:pPr>
         <w:numPr>
           <w:ilvl w:val="0"/>
-          <w:numId w:val="2"/>
+          <w:numId w:val="4"/>
         </w:numPr>
         <w:spacing w:after="0" w:afterAutospacing="0" w:before="0" w:beforeAutospacing="0" w:lineRule="auto"/>
         <w:ind w:left="720" w:hanging="360"/>
@@ -576,7 +1452,7 @@
       <w:pPr>
         <w:numPr>
           <w:ilvl w:val="0"/>
-          <w:numId w:val="2"/>
+          <w:numId w:val="4"/>
         </w:numPr>
         <w:spacing w:after="240" w:before="0" w:beforeAutospacing="0" w:lineRule="auto"/>
         <w:ind w:left="720" w:hanging="360"/>
@@ -665,7 +1541,7 @@
         <w:keepLines w:val="0"/>
         <w:numPr>
           <w:ilvl w:val="0"/>
-          <w:numId w:val="14"/>
+          <w:numId w:val="19"/>
         </w:numPr>
         <w:spacing w:after="0" w:afterAutospacing="0" w:before="280" w:lineRule="auto"/>
         <w:ind w:left="720" w:hanging="360"/>
@@ -695,7 +1571,7 @@
       <w:pPr>
         <w:numPr>
           <w:ilvl w:val="0"/>
-          <w:numId w:val="6"/>
+          <w:numId w:val="10"/>
         </w:numPr>
         <w:spacing w:after="0" w:afterAutospacing="0" w:before="0" w:beforeAutospacing="0" w:lineRule="auto"/>
         <w:ind w:left="720" w:hanging="360"/>
@@ -725,7 +1601,7 @@
       <w:pPr>
         <w:numPr>
           <w:ilvl w:val="0"/>
-          <w:numId w:val="6"/>
+          <w:numId w:val="10"/>
         </w:numPr>
         <w:spacing w:after="0" w:afterAutospacing="0" w:before="0" w:beforeAutospacing="0" w:lineRule="auto"/>
         <w:ind w:left="720" w:hanging="360"/>
@@ -744,7 +1620,7 @@
       <w:pPr>
         <w:numPr>
           <w:ilvl w:val="0"/>
-          <w:numId w:val="6"/>
+          <w:numId w:val="10"/>
         </w:numPr>
         <w:spacing w:after="240" w:before="0" w:beforeAutospacing="0" w:lineRule="auto"/>
         <w:ind w:left="720" w:hanging="360"/>
@@ -850,7 +1726,7 @@
         <w:keepLines w:val="0"/>
         <w:numPr>
           <w:ilvl w:val="0"/>
-          <w:numId w:val="14"/>
+          <w:numId w:val="19"/>
         </w:numPr>
         <w:spacing w:after="0" w:afterAutospacing="0" w:before="280" w:lineRule="auto"/>
         <w:ind w:left="720" w:hanging="360"/>
@@ -880,7 +1756,7 @@
       <w:pPr>
         <w:numPr>
           <w:ilvl w:val="0"/>
-          <w:numId w:val="12"/>
+          <w:numId w:val="16"/>
         </w:numPr>
         <w:spacing w:after="0" w:afterAutospacing="0" w:before="0" w:beforeAutospacing="0" w:lineRule="auto"/>
         <w:ind w:left="720" w:hanging="360"/>
@@ -910,7 +1786,7 @@
       <w:pPr>
         <w:numPr>
           <w:ilvl w:val="0"/>
-          <w:numId w:val="12"/>
+          <w:numId w:val="16"/>
         </w:numPr>
         <w:spacing w:after="0" w:afterAutospacing="0" w:before="0" w:beforeAutospacing="0" w:lineRule="auto"/>
         <w:ind w:left="720" w:hanging="360"/>
@@ -926,7 +1802,7 @@
       <w:pPr>
         <w:numPr>
           <w:ilvl w:val="0"/>
-          <w:numId w:val="12"/>
+          <w:numId w:val="16"/>
         </w:numPr>
         <w:spacing w:after="0" w:afterAutospacing="0" w:before="0" w:beforeAutospacing="0" w:lineRule="auto"/>
         <w:ind w:left="720" w:hanging="360"/>
@@ -942,7 +1818,7 @@
       <w:pPr>
         <w:numPr>
           <w:ilvl w:val="1"/>
-          <w:numId w:val="12"/>
+          <w:numId w:val="16"/>
         </w:numPr>
         <w:spacing w:after="0" w:afterAutospacing="0" w:before="0" w:beforeAutospacing="0" w:lineRule="auto"/>
         <w:ind w:left="1440" w:hanging="360"/>
@@ -958,7 +1834,7 @@
       <w:pPr>
         <w:numPr>
           <w:ilvl w:val="1"/>
-          <w:numId w:val="12"/>
+          <w:numId w:val="16"/>
         </w:numPr>
         <w:spacing w:after="0" w:afterAutospacing="0" w:before="0" w:beforeAutospacing="0" w:lineRule="auto"/>
         <w:ind w:left="1440" w:hanging="360"/>
@@ -974,7 +1850,7 @@
       <w:pPr>
         <w:numPr>
           <w:ilvl w:val="1"/>
-          <w:numId w:val="12"/>
+          <w:numId w:val="16"/>
         </w:numPr>
         <w:spacing w:after="0" w:afterAutospacing="0" w:before="0" w:beforeAutospacing="0" w:lineRule="auto"/>
         <w:ind w:left="1440" w:hanging="360"/>
@@ -990,7 +1866,7 @@
       <w:pPr>
         <w:numPr>
           <w:ilvl w:val="1"/>
-          <w:numId w:val="12"/>
+          <w:numId w:val="16"/>
         </w:numPr>
         <w:spacing w:after="0" w:afterAutospacing="0" w:before="0" w:beforeAutospacing="0" w:lineRule="auto"/>
         <w:ind w:left="1440" w:hanging="360"/>
@@ -1009,7 +1885,7 @@
       <w:pPr>
         <w:numPr>
           <w:ilvl w:val="0"/>
-          <w:numId w:val="12"/>
+          <w:numId w:val="16"/>
         </w:numPr>
         <w:spacing w:after="240" w:before="0" w:beforeAutospacing="0" w:lineRule="auto"/>
         <w:ind w:left="720" w:hanging="360"/>
@@ -1020,7 +1896,7 @@
         </w:rPr>
         <w:t xml:space="preserve">Já possuímos as fotos/mini bios e logo dos palestrantes neste link: </w:t>
       </w:r>
-      <w:hyperlink r:id="rId10">
+      <w:hyperlink r:id="rId17">
         <w:r>
           <w:rPr>
             <w:color w:val="1155cc"/>
@@ -1056,16 +1932,16 @@
           <wp:inline distB="114300" distT="114300" distL="114300" distR="114300">
             <wp:extent cx="3652838" cy="1607585"/>
             <wp:effectExtent b="0" l="0" r="0" t="0"/>
-            <wp:docPr id="2" name="image4.png"/>
+            <wp:docPr id="6" name="image8.png"/>
             <a:graphic>
               <a:graphicData uri="http://schemas.openxmlformats.org/drawingml/2006/picture">
                 <pic:pic>
                   <pic:nvPicPr>
-                    <pic:cNvPr id="0" name="image4.png"/>
+                    <pic:cNvPr id="0" name="image8.png"/>
                     <pic:cNvPicPr preferRelativeResize="0"/>
                   </pic:nvPicPr>
                   <pic:blipFill>
-                    <a:blip r:embed="rId11"/>
+                    <a:blip r:embed="rId18"/>
                     <a:srcRect b="0" l="0" r="0" t="0"/>
                     <a:stretch>
                       <a:fillRect/>
@@ -1095,7 +1971,7 @@
       <w:pPr>
         <w:numPr>
           <w:ilvl w:val="0"/>
-          <w:numId w:val="14"/>
+          <w:numId w:val="19"/>
         </w:numPr>
         <w:spacing w:after="0" w:afterAutospacing="0" w:before="240" w:lineRule="auto"/>
         <w:ind w:left="720" w:hanging="360"/>
@@ -1117,7 +1993,7 @@
       <w:pPr>
         <w:numPr>
           <w:ilvl w:val="0"/>
-          <w:numId w:val="16"/>
+          <w:numId w:val="21"/>
         </w:numPr>
         <w:spacing w:after="240" w:before="0" w:beforeAutospacing="0" w:lineRule="auto"/>
         <w:ind w:left="1440" w:hanging="360"/>
@@ -1142,16 +2018,16 @@
           <wp:inline distB="114300" distT="114300" distL="114300" distR="114300">
             <wp:extent cx="3228975" cy="628650"/>
             <wp:effectExtent b="0" l="0" r="0" t="0"/>
-            <wp:docPr id="5" name="image2.png"/>
+            <wp:docPr id="2" name="image5.png"/>
             <a:graphic>
               <a:graphicData uri="http://schemas.openxmlformats.org/drawingml/2006/picture">
                 <pic:pic>
                   <pic:nvPicPr>
-                    <pic:cNvPr id="0" name="image2.png"/>
+                    <pic:cNvPr id="0" name="image5.png"/>
                     <pic:cNvPicPr preferRelativeResize="0"/>
                   </pic:nvPicPr>
                   <pic:blipFill>
-                    <a:blip r:embed="rId12"/>
+                    <a:blip r:embed="rId19"/>
                     <a:srcRect b="0" l="0" r="0" t="0"/>
                     <a:stretch>
                       <a:fillRect/>
@@ -1181,7 +2057,7 @@
       <w:pPr>
         <w:numPr>
           <w:ilvl w:val="0"/>
-          <w:numId w:val="4"/>
+          <w:numId w:val="8"/>
         </w:numPr>
         <w:spacing w:after="240" w:before="240" w:lineRule="auto"/>
         <w:ind w:left="720" w:hanging="360"/>
@@ -1432,7 +2308,7 @@
         <w:keepLines w:val="0"/>
         <w:numPr>
           <w:ilvl w:val="0"/>
-          <w:numId w:val="14"/>
+          <w:numId w:val="19"/>
         </w:numPr>
         <w:spacing w:after="0" w:afterAutospacing="0" w:before="280" w:lineRule="auto"/>
         <w:ind w:left="720" w:hanging="360"/>
@@ -1462,7 +2338,7 @@
       <w:pPr>
         <w:numPr>
           <w:ilvl w:val="0"/>
-          <w:numId w:val="17"/>
+          <w:numId w:val="23"/>
         </w:numPr>
         <w:spacing w:after="240" w:before="0" w:beforeAutospacing="0" w:lineRule="auto"/>
         <w:ind w:left="720" w:hanging="360"/>
@@ -1507,16 +2383,16 @@
           <wp:inline distB="114300" distT="114300" distL="114300" distR="114300">
             <wp:extent cx="4748213" cy="1041136"/>
             <wp:effectExtent b="0" l="0" r="0" t="0"/>
-            <wp:docPr id="4" name="image3.png"/>
+            <wp:docPr id="8" name="image4.png"/>
             <a:graphic>
               <a:graphicData uri="http://schemas.openxmlformats.org/drawingml/2006/picture">
                 <pic:pic>
                   <pic:nvPicPr>
-                    <pic:cNvPr id="0" name="image3.png"/>
+                    <pic:cNvPr id="0" name="image4.png"/>
                     <pic:cNvPicPr preferRelativeResize="0"/>
                   </pic:nvPicPr>
                   <pic:blipFill>
-                    <a:blip r:embed="rId13"/>
+                    <a:blip r:embed="rId20"/>
                     <a:srcRect b="0" l="0" r="0" t="0"/>
                     <a:stretch>
                       <a:fillRect/>
@@ -1574,7 +2450,7 @@
       <w:pPr>
         <w:numPr>
           <w:ilvl w:val="0"/>
-          <w:numId w:val="3"/>
+          <w:numId w:val="7"/>
         </w:numPr>
         <w:spacing w:after="0" w:afterAutospacing="0" w:before="240" w:lineRule="auto"/>
         <w:ind w:left="720" w:hanging="360"/>
@@ -1590,7 +2466,7 @@
       <w:pPr>
         <w:numPr>
           <w:ilvl w:val="0"/>
-          <w:numId w:val="3"/>
+          <w:numId w:val="7"/>
         </w:numPr>
         <w:spacing w:after="240" w:before="0" w:beforeAutospacing="0" w:lineRule="auto"/>
         <w:ind w:left="720" w:hanging="360"/>
@@ -1683,7 +2559,7 @@
       <w:pPr>
         <w:numPr>
           <w:ilvl w:val="0"/>
-          <w:numId w:val="11"/>
+          <w:numId w:val="15"/>
         </w:numPr>
         <w:spacing w:after="0" w:afterAutospacing="0" w:before="240" w:lineRule="auto"/>
         <w:ind w:left="720" w:hanging="360"/>
@@ -1699,7 +2575,7 @@
       <w:pPr>
         <w:numPr>
           <w:ilvl w:val="0"/>
-          <w:numId w:val="11"/>
+          <w:numId w:val="15"/>
         </w:numPr>
         <w:spacing w:after="240" w:before="0" w:beforeAutospacing="0" w:lineRule="auto"/>
         <w:ind w:left="720" w:hanging="360"/>
@@ -1772,7 +2648,7 @@
       <w:pPr>
         <w:numPr>
           <w:ilvl w:val="0"/>
-          <w:numId w:val="14"/>
+          <w:numId w:val="19"/>
         </w:numPr>
         <w:ind w:left="720" w:hanging="360"/>
         <w:rPr>
@@ -1803,7 +2679,7 @@
       <w:pPr>
         <w:numPr>
           <w:ilvl w:val="0"/>
-          <w:numId w:val="18"/>
+          <w:numId w:val="25"/>
         </w:numPr>
         <w:ind w:left="720" w:hanging="360"/>
         <w:rPr>
@@ -1845,7 +2721,7 @@
       <w:pPr>
         <w:numPr>
           <w:ilvl w:val="0"/>
-          <w:numId w:val="14"/>
+          <w:numId w:val="19"/>
         </w:numPr>
         <w:ind w:left="720" w:hanging="360"/>
         <w:rPr>
@@ -1905,7 +2781,7 @@
       <w:pPr>
         <w:numPr>
           <w:ilvl w:val="0"/>
-          <w:numId w:val="14"/>
+          <w:numId w:val="19"/>
         </w:numPr>
         <w:ind w:left="720" w:hanging="360"/>
         <w:rPr>
@@ -1926,7 +2802,7 @@
       <w:pPr>
         <w:numPr>
           <w:ilvl w:val="0"/>
-          <w:numId w:val="13"/>
+          <w:numId w:val="18"/>
         </w:numPr>
         <w:ind w:left="720" w:hanging="360"/>
         <w:rPr/>
@@ -1942,7 +2818,7 @@
       <w:pPr>
         <w:numPr>
           <w:ilvl w:val="0"/>
-          <w:numId w:val="13"/>
+          <w:numId w:val="18"/>
         </w:numPr>
         <w:ind w:left="720" w:hanging="360"/>
         <w:rPr/>
@@ -1982,7 +2858,7 @@
       <w:pPr>
         <w:numPr>
           <w:ilvl w:val="0"/>
-          <w:numId w:val="14"/>
+          <w:numId w:val="19"/>
         </w:numPr>
         <w:ind w:left="720" w:hanging="360"/>
         <w:rPr>
@@ -2003,7 +2879,7 @@
       <w:pPr>
         <w:numPr>
           <w:ilvl w:val="0"/>
-          <w:numId w:val="7"/>
+          <w:numId w:val="11"/>
         </w:numPr>
         <w:ind w:left="720" w:hanging="360"/>
         <w:rPr/>
@@ -2053,7 +2929,7 @@
       <w:pPr>
         <w:numPr>
           <w:ilvl w:val="0"/>
-          <w:numId w:val="8"/>
+          <w:numId w:val="12"/>
         </w:numPr>
         <w:ind w:left="720" w:hanging="360"/>
       </w:pPr>
@@ -2068,7 +2944,7 @@
       <w:pPr>
         <w:numPr>
           <w:ilvl w:val="0"/>
-          <w:numId w:val="8"/>
+          <w:numId w:val="12"/>
         </w:numPr>
         <w:ind w:left="720" w:hanging="360"/>
         <w:rPr>
@@ -2081,16 +2957,16 @@
           <wp:inline distB="114300" distT="114300" distL="114300" distR="114300">
             <wp:extent cx="3390900" cy="714375"/>
             <wp:effectExtent b="0" l="0" r="0" t="0"/>
-            <wp:docPr id="3" name="image5.png"/>
+            <wp:docPr id="7" name="image7.png"/>
             <a:graphic>
               <a:graphicData uri="http://schemas.openxmlformats.org/drawingml/2006/picture">
                 <pic:pic>
                   <pic:nvPicPr>
-                    <pic:cNvPr id="0" name="image5.png"/>
+                    <pic:cNvPr id="0" name="image7.png"/>
                     <pic:cNvPicPr preferRelativeResize="0"/>
                   </pic:nvPicPr>
                   <pic:blipFill>
-                    <a:blip r:embed="rId14"/>
+                    <a:blip r:embed="rId21"/>
                     <a:srcRect b="0" l="0" r="0" t="0"/>
                     <a:stretch>
                       <a:fillRect/>
@@ -2148,31 +3024,31 @@
       <w:pPr>
         <w:numPr>
           <w:ilvl w:val="0"/>
+          <w:numId w:val="19"/>
+        </w:numPr>
+        <w:ind w:left="720" w:hanging="360"/>
+        <w:rPr>
+          <w:b w:val="1"/>
+          <w:bCs w:val="1"/>
+        </w:rPr>
+      </w:pPr>
+      <w:r>
+        <w:rPr>
+          <w:b w:val="1"/>
+          <w:bCs w:val="1"/>
+          <w:rtl w:val="0"/>
+        </w:rPr>
+        <w:t xml:space="preserve">Menu Programação</w:t>
+      </w:r>
+    </w:p>
+    <w:p>
+      <w:pPr>
+        <w:numPr>
+          <w:ilvl w:val="0"/>
           <w:numId w:val="14"/>
         </w:numPr>
         <w:ind w:left="720" w:hanging="360"/>
         <w:rPr>
-          <w:b w:val="1"/>
-          <w:bCs w:val="1"/>
-        </w:rPr>
-      </w:pPr>
-      <w:r>
-        <w:rPr>
-          <w:b w:val="1"/>
-          <w:bCs w:val="1"/>
-          <w:rtl w:val="0"/>
-        </w:rPr>
-        <w:t xml:space="preserve">Menu Programação</w:t>
-      </w:r>
-    </w:p>
-    <w:p>
-      <w:pPr>
-        <w:numPr>
-          <w:ilvl w:val="0"/>
-          <w:numId w:val="10"/>
-        </w:numPr>
-        <w:ind w:left="720" w:hanging="360"/>
-        <w:rPr>
           <w:u w:val="none"/>
         </w:rPr>
       </w:pPr>
@@ -2187,7 +3063,7 @@
       <w:pPr>
         <w:numPr>
           <w:ilvl w:val="0"/>
-          <w:numId w:val="10"/>
+          <w:numId w:val="14"/>
         </w:numPr>
         <w:ind w:left="720" w:hanging="360"/>
         <w:rPr>
@@ -2205,7 +3081,7 @@
       <w:pPr>
         <w:numPr>
           <w:ilvl w:val="0"/>
-          <w:numId w:val="10"/>
+          <w:numId w:val="14"/>
         </w:numPr>
         <w:ind w:left="720" w:hanging="360"/>
         <w:rPr>
@@ -2223,7 +3099,7 @@
       <w:pPr>
         <w:numPr>
           <w:ilvl w:val="0"/>
-          <w:numId w:val="10"/>
+          <w:numId w:val="14"/>
         </w:numPr>
         <w:ind w:left="720" w:hanging="360"/>
         <w:rPr>
@@ -2251,7 +3127,7 @@
       <w:pPr>
         <w:numPr>
           <w:ilvl w:val="0"/>
-          <w:numId w:val="14"/>
+          <w:numId w:val="19"/>
         </w:numPr>
         <w:ind w:left="720" w:hanging="360"/>
         <w:rPr>
@@ -2272,7 +3148,7 @@
       <w:pPr>
         <w:numPr>
           <w:ilvl w:val="0"/>
-          <w:numId w:val="1"/>
+          <w:numId w:val="3"/>
         </w:numPr>
         <w:ind w:left="720" w:hanging="360"/>
         <w:rPr>
@@ -2442,7 +3318,7 @@
       <w:pPr>
         <w:numPr>
           <w:ilvl w:val="0"/>
-          <w:numId w:val="14"/>
+          <w:numId w:val="19"/>
         </w:numPr>
         <w:ind w:left="720" w:hanging="360"/>
         <w:rPr>
@@ -2677,7 +3553,7 @@
       <w:pPr>
         <w:numPr>
           <w:ilvl w:val="0"/>
-          <w:numId w:val="5"/>
+          <w:numId w:val="9"/>
         </w:numPr>
         <w:ind w:left="720" w:hanging="360"/>
         <w:rPr>
@@ -2695,7 +3571,7 @@
       <w:pPr>
         <w:numPr>
           <w:ilvl w:val="0"/>
-          <w:numId w:val="5"/>
+          <w:numId w:val="9"/>
         </w:numPr>
         <w:ind w:left="720" w:hanging="360"/>
         <w:rPr>
@@ -2713,7 +3589,7 @@
       <w:pPr>
         <w:numPr>
           <w:ilvl w:val="0"/>
-          <w:numId w:val="5"/>
+          <w:numId w:val="9"/>
         </w:numPr>
         <w:ind w:left="720" w:hanging="360"/>
         <w:rPr>
@@ -2737,7 +3613,7 @@
       <w:pPr>
         <w:numPr>
           <w:ilvl w:val="0"/>
-          <w:numId w:val="5"/>
+          <w:numId w:val="9"/>
         </w:numPr>
         <w:ind w:left="720" w:hanging="360"/>
         <w:rPr>
@@ -2755,7 +3631,7 @@
       <w:pPr>
         <w:numPr>
           <w:ilvl w:val="0"/>
-          <w:numId w:val="5"/>
+          <w:numId w:val="9"/>
         </w:numPr>
         <w:ind w:left="720" w:hanging="360"/>
         <w:rPr>
@@ -2810,16 +3686,16 @@
           <wp:inline distB="114300" distT="114300" distL="114300" distR="114300">
             <wp:extent cx="5731200" cy="1346200"/>
             <wp:effectExtent b="0" l="0" r="0" t="0"/>
-            <wp:docPr id="1" name="image1.png"/>
+            <wp:docPr id="5" name="image2.png"/>
             <a:graphic>
               <a:graphicData uri="http://schemas.openxmlformats.org/drawingml/2006/picture">
                 <pic:pic>
                   <pic:nvPicPr>
-                    <pic:cNvPr id="0" name="image1.png"/>
+                    <pic:cNvPr id="0" name="image2.png"/>
                     <pic:cNvPicPr preferRelativeResize="0"/>
                   </pic:nvPicPr>
                   <pic:blipFill>
-                    <a:blip r:embed="rId15"/>
+                    <a:blip r:embed="rId22"/>
                     <a:srcRect b="0" l="0" r="0" t="0"/>
                     <a:stretch>
                       <a:fillRect/>
@@ -2979,8 +3855,8 @@
   <w:abstractNum w:abstractNumId="2">
     <w:lvl w:ilvl="0">
       <w:start w:val="1"/>
-      <w:numFmt w:val="bullet"/>
-      <w:lvlText w:val="●"/>
+      <w:numFmt w:val="decimal"/>
+      <w:lvlText w:val="%1."/>
       <w:lvlJc w:val="left"/>
       <w:pPr>
         <w:ind w:left="720" w:hanging="360"/>
@@ -2991,8 +3867,8 @@
     </w:lvl>
     <w:lvl w:ilvl="1">
       <w:start w:val="1"/>
-      <w:numFmt w:val="bullet"/>
-      <w:lvlText w:val="○"/>
+      <w:numFmt w:val="lowerLetter"/>
+      <w:lvlText w:val="%2."/>
       <w:lvlJc w:val="left"/>
       <w:pPr>
         <w:ind w:left="1440" w:hanging="360"/>
@@ -3003,9 +3879,9 @@
     </w:lvl>
     <w:lvl w:ilvl="2">
       <w:start w:val="1"/>
-      <w:numFmt w:val="bullet"/>
-      <w:lvlText w:val="■"/>
-      <w:lvlJc w:val="left"/>
+      <w:numFmt w:val="lowerRoman"/>
+      <w:lvlText w:val="%3."/>
+      <w:lvlJc w:val="right"/>
       <w:pPr>
         <w:ind w:left="2160" w:hanging="360"/>
       </w:pPr>
@@ -3015,8 +3891,8 @@
     </w:lvl>
     <w:lvl w:ilvl="3">
       <w:start w:val="1"/>
-      <w:numFmt w:val="bullet"/>
-      <w:lvlText w:val="●"/>
+      <w:numFmt w:val="decimal"/>
+      <w:lvlText w:val="%4."/>
       <w:lvlJc w:val="left"/>
       <w:pPr>
         <w:ind w:left="2880" w:hanging="360"/>
@@ -3027,8 +3903,8 @@
     </w:lvl>
     <w:lvl w:ilvl="4">
       <w:start w:val="1"/>
-      <w:numFmt w:val="bullet"/>
-      <w:lvlText w:val="○"/>
+      <w:numFmt w:val="lowerLetter"/>
+      <w:lvlText w:val="%5."/>
       <w:lvlJc w:val="left"/>
       <w:pPr>
         <w:ind w:left="3600" w:hanging="360"/>
@@ -3039,9 +3915,9 @@
     </w:lvl>
     <w:lvl w:ilvl="5">
       <w:start w:val="1"/>
-      <w:numFmt w:val="bullet"/>
-      <w:lvlText w:val="■"/>
-      <w:lvlJc w:val="left"/>
+      <w:numFmt w:val="lowerRoman"/>
+      <w:lvlText w:val="%6."/>
+      <w:lvlJc w:val="right"/>
       <w:pPr>
         <w:ind w:left="4320" w:hanging="360"/>
       </w:pPr>
@@ -3051,8 +3927,8 @@
     </w:lvl>
     <w:lvl w:ilvl="6">
       <w:start w:val="1"/>
-      <w:numFmt w:val="bullet"/>
-      <w:lvlText w:val="●"/>
+      <w:numFmt w:val="decimal"/>
+      <w:lvlText w:val="%7."/>
       <w:lvlJc w:val="left"/>
       <w:pPr>
         <w:ind w:left="5040" w:hanging="360"/>
@@ -3063,8 +3939,8 @@
     </w:lvl>
     <w:lvl w:ilvl="7">
       <w:start w:val="1"/>
-      <w:numFmt w:val="bullet"/>
-      <w:lvlText w:val="○"/>
+      <w:numFmt w:val="lowerLetter"/>
+      <w:lvlText w:val="%8."/>
       <w:lvlJc w:val="left"/>
       <w:pPr>
         <w:ind w:left="5760" w:hanging="360"/>
@@ -3075,9 +3951,9 @@
     </w:lvl>
     <w:lvl w:ilvl="8">
       <w:start w:val="1"/>
-      <w:numFmt w:val="bullet"/>
-      <w:lvlText w:val="■"/>
-      <w:lvlJc w:val="left"/>
+      <w:numFmt w:val="lowerRoman"/>
+      <w:lvlText w:val="%9."/>
+      <w:lvlJc w:val="right"/>
       <w:pPr>
         <w:ind w:left="6480" w:hanging="360"/>
       </w:pPr>
@@ -3090,7 +3966,7 @@
     <w:lvl w:ilvl="0">
       <w:start w:val="1"/>
       <w:numFmt w:val="bullet"/>
-      <w:lvlText w:val="●"/>
+      <w:lvlText w:val="-"/>
       <w:lvlJc w:val="left"/>
       <w:pPr>
         <w:ind w:left="720" w:hanging="360"/>
@@ -3102,7 +3978,7 @@
     <w:lvl w:ilvl="1">
       <w:start w:val="1"/>
       <w:numFmt w:val="bullet"/>
-      <w:lvlText w:val="○"/>
+      <w:lvlText w:val="-"/>
       <w:lvlJc w:val="left"/>
       <w:pPr>
         <w:ind w:left="1440" w:hanging="360"/>
@@ -3114,7 +3990,7 @@
     <w:lvl w:ilvl="2">
       <w:start w:val="1"/>
       <w:numFmt w:val="bullet"/>
-      <w:lvlText w:val="■"/>
+      <w:lvlText w:val="-"/>
       <w:lvlJc w:val="left"/>
       <w:pPr>
         <w:ind w:left="2160" w:hanging="360"/>
@@ -3126,7 +4002,7 @@
     <w:lvl w:ilvl="3">
       <w:start w:val="1"/>
       <w:numFmt w:val="bullet"/>
-      <w:lvlText w:val="●"/>
+      <w:lvlText w:val="-"/>
       <w:lvlJc w:val="left"/>
       <w:pPr>
         <w:ind w:left="2880" w:hanging="360"/>
@@ -3138,7 +4014,7 @@
     <w:lvl w:ilvl="4">
       <w:start w:val="1"/>
       <w:numFmt w:val="bullet"/>
-      <w:lvlText w:val="○"/>
+      <w:lvlText w:val="-"/>
       <w:lvlJc w:val="left"/>
       <w:pPr>
         <w:ind w:left="3600" w:hanging="360"/>
@@ -3150,7 +4026,7 @@
     <w:lvl w:ilvl="5">
       <w:start w:val="1"/>
       <w:numFmt w:val="bullet"/>
-      <w:lvlText w:val="■"/>
+      <w:lvlText w:val="-"/>
       <w:lvlJc w:val="left"/>
       <w:pPr>
         <w:ind w:left="4320" w:hanging="360"/>
@@ -3162,7 +4038,7 @@
     <w:lvl w:ilvl="6">
       <w:start w:val="1"/>
       <w:numFmt w:val="bullet"/>
-      <w:lvlText w:val="●"/>
+      <w:lvlText w:val="-"/>
       <w:lvlJc w:val="left"/>
       <w:pPr>
         <w:ind w:left="5040" w:hanging="360"/>
@@ -3174,7 +4050,7 @@
     <w:lvl w:ilvl="7">
       <w:start w:val="1"/>
       <w:numFmt w:val="bullet"/>
-      <w:lvlText w:val="○"/>
+      <w:lvlText w:val="-"/>
       <w:lvlJc w:val="left"/>
       <w:pPr>
         <w:ind w:left="5760" w:hanging="360"/>
@@ -3186,7 +4062,7 @@
     <w:lvl w:ilvl="8">
       <w:start w:val="1"/>
       <w:numFmt w:val="bullet"/>
-      <w:lvlText w:val="■"/>
+      <w:lvlText w:val="-"/>
       <w:lvlJc w:val="left"/>
       <w:pPr>
         <w:ind w:left="6480" w:hanging="360"/>
@@ -3420,7 +4296,7 @@
     <w:lvl w:ilvl="0">
       <w:start w:val="1"/>
       <w:numFmt w:val="bullet"/>
-      <w:lvlText w:val="●"/>
+      <w:lvlText w:val="-"/>
       <w:lvlJc w:val="left"/>
       <w:pPr>
         <w:ind w:left="720" w:hanging="360"/>
@@ -3432,7 +4308,7 @@
     <w:lvl w:ilvl="1">
       <w:start w:val="1"/>
       <w:numFmt w:val="bullet"/>
-      <w:lvlText w:val="○"/>
+      <w:lvlText w:val="-"/>
       <w:lvlJc w:val="left"/>
       <w:pPr>
         <w:ind w:left="1440" w:hanging="360"/>
@@ -3444,7 +4320,7 @@
     <w:lvl w:ilvl="2">
       <w:start w:val="1"/>
       <w:numFmt w:val="bullet"/>
-      <w:lvlText w:val="■"/>
+      <w:lvlText w:val="-"/>
       <w:lvlJc w:val="left"/>
       <w:pPr>
         <w:ind w:left="2160" w:hanging="360"/>
@@ -3456,7 +4332,7 @@
     <w:lvl w:ilvl="3">
       <w:start w:val="1"/>
       <w:numFmt w:val="bullet"/>
-      <w:lvlText w:val="●"/>
+      <w:lvlText w:val="-"/>
       <w:lvlJc w:val="left"/>
       <w:pPr>
         <w:ind w:left="2880" w:hanging="360"/>
@@ -3468,7 +4344,7 @@
     <w:lvl w:ilvl="4">
       <w:start w:val="1"/>
       <w:numFmt w:val="bullet"/>
-      <w:lvlText w:val="○"/>
+      <w:lvlText w:val="-"/>
       <w:lvlJc w:val="left"/>
       <w:pPr>
         <w:ind w:left="3600" w:hanging="360"/>
@@ -3480,7 +4356,7 @@
     <w:lvl w:ilvl="5">
       <w:start w:val="1"/>
       <w:numFmt w:val="bullet"/>
-      <w:lvlText w:val="■"/>
+      <w:lvlText w:val="-"/>
       <w:lvlJc w:val="left"/>
       <w:pPr>
         <w:ind w:left="4320" w:hanging="360"/>
@@ -3492,7 +4368,7 @@
     <w:lvl w:ilvl="6">
       <w:start w:val="1"/>
       <w:numFmt w:val="bullet"/>
-      <w:lvlText w:val="●"/>
+      <w:lvlText w:val="-"/>
       <w:lvlJc w:val="left"/>
       <w:pPr>
         <w:ind w:left="5040" w:hanging="360"/>
@@ -3504,7 +4380,7 @@
     <w:lvl w:ilvl="7">
       <w:start w:val="1"/>
       <w:numFmt w:val="bullet"/>
-      <w:lvlText w:val="○"/>
+      <w:lvlText w:val="-"/>
       <w:lvlJc w:val="left"/>
       <w:pPr>
         <w:ind w:left="5760" w:hanging="360"/>
@@ -3516,7 +4392,7 @@
     <w:lvl w:ilvl="8">
       <w:start w:val="1"/>
       <w:numFmt w:val="bullet"/>
-      <w:lvlText w:val="■"/>
+      <w:lvlText w:val="-"/>
       <w:lvlJc w:val="left"/>
       <w:pPr>
         <w:ind w:left="6480" w:hanging="360"/>
@@ -3640,7 +4516,7 @@
     <w:lvl w:ilvl="0">
       <w:start w:val="1"/>
       <w:numFmt w:val="bullet"/>
-      <w:lvlText w:val="-"/>
+      <w:lvlText w:val="●"/>
       <w:lvlJc w:val="left"/>
       <w:pPr>
         <w:ind w:left="720" w:hanging="360"/>
@@ -3652,7 +4528,7 @@
     <w:lvl w:ilvl="1">
       <w:start w:val="1"/>
       <w:numFmt w:val="bullet"/>
-      <w:lvlText w:val="-"/>
+      <w:lvlText w:val="○"/>
       <w:lvlJc w:val="left"/>
       <w:pPr>
         <w:ind w:left="1440" w:hanging="360"/>
@@ -3664,7 +4540,7 @@
     <w:lvl w:ilvl="2">
       <w:start w:val="1"/>
       <w:numFmt w:val="bullet"/>
-      <w:lvlText w:val="-"/>
+      <w:lvlText w:val="■"/>
       <w:lvlJc w:val="left"/>
       <w:pPr>
         <w:ind w:left="2160" w:hanging="360"/>
@@ -3676,7 +4552,7 @@
     <w:lvl w:ilvl="3">
       <w:start w:val="1"/>
       <w:numFmt w:val="bullet"/>
-      <w:lvlText w:val="-"/>
+      <w:lvlText w:val="●"/>
       <w:lvlJc w:val="left"/>
       <w:pPr>
         <w:ind w:left="2880" w:hanging="360"/>
@@ -3688,7 +4564,7 @@
     <w:lvl w:ilvl="4">
       <w:start w:val="1"/>
       <w:numFmt w:val="bullet"/>
-      <w:lvlText w:val="-"/>
+      <w:lvlText w:val="○"/>
       <w:lvlJc w:val="left"/>
       <w:pPr>
         <w:ind w:left="3600" w:hanging="360"/>
@@ -3700,7 +4576,7 @@
     <w:lvl w:ilvl="5">
       <w:start w:val="1"/>
       <w:numFmt w:val="bullet"/>
-      <w:lvlText w:val="-"/>
+      <w:lvlText w:val="■"/>
       <w:lvlJc w:val="left"/>
       <w:pPr>
         <w:ind w:left="4320" w:hanging="360"/>
@@ -3712,7 +4588,7 @@
     <w:lvl w:ilvl="6">
       <w:start w:val="1"/>
       <w:numFmt w:val="bullet"/>
-      <w:lvlText w:val="-"/>
+      <w:lvlText w:val="●"/>
       <w:lvlJc w:val="left"/>
       <w:pPr>
         <w:ind w:left="5040" w:hanging="360"/>
@@ -3724,7 +4600,7 @@
     <w:lvl w:ilvl="7">
       <w:start w:val="1"/>
       <w:numFmt w:val="bullet"/>
-      <w:lvlText w:val="-"/>
+      <w:lvlText w:val="○"/>
       <w:lvlJc w:val="left"/>
       <w:pPr>
         <w:ind w:left="5760" w:hanging="360"/>
@@ -3736,7 +4612,7 @@
     <w:lvl w:ilvl="8">
       <w:start w:val="1"/>
       <w:numFmt w:val="bullet"/>
-      <w:lvlText w:val="-"/>
+      <w:lvlText w:val="■"/>
       <w:lvlJc w:val="left"/>
       <w:pPr>
         <w:ind w:left="6480" w:hanging="360"/>
@@ -3750,7 +4626,7 @@
     <w:lvl w:ilvl="0">
       <w:start w:val="1"/>
       <w:numFmt w:val="bullet"/>
-      <w:lvlText w:val="●"/>
+      <w:lvlText w:val="-"/>
       <w:lvlJc w:val="left"/>
       <w:pPr>
         <w:ind w:left="720" w:hanging="360"/>
@@ -3762,7 +4638,7 @@
     <w:lvl w:ilvl="1">
       <w:start w:val="1"/>
       <w:numFmt w:val="bullet"/>
-      <w:lvlText w:val="○"/>
+      <w:lvlText w:val="-"/>
       <w:lvlJc w:val="left"/>
       <w:pPr>
         <w:ind w:left="1440" w:hanging="360"/>
@@ -3774,7 +4650,7 @@
     <w:lvl w:ilvl="2">
       <w:start w:val="1"/>
       <w:numFmt w:val="bullet"/>
-      <w:lvlText w:val="■"/>
+      <w:lvlText w:val="-"/>
       <w:lvlJc w:val="left"/>
       <w:pPr>
         <w:ind w:left="2160" w:hanging="360"/>
@@ -3786,7 +4662,7 @@
     <w:lvl w:ilvl="3">
       <w:start w:val="1"/>
       <w:numFmt w:val="bullet"/>
-      <w:lvlText w:val="●"/>
+      <w:lvlText w:val="-"/>
       <w:lvlJc w:val="left"/>
       <w:pPr>
         <w:ind w:left="2880" w:hanging="360"/>
@@ -3798,7 +4674,7 @@
     <w:lvl w:ilvl="4">
       <w:start w:val="1"/>
       <w:numFmt w:val="bullet"/>
-      <w:lvlText w:val="○"/>
+      <w:lvlText w:val="-"/>
       <w:lvlJc w:val="left"/>
       <w:pPr>
         <w:ind w:left="3600" w:hanging="360"/>
@@ -3810,7 +4686,7 @@
     <w:lvl w:ilvl="5">
       <w:start w:val="1"/>
       <w:numFmt w:val="bullet"/>
-      <w:lvlText w:val="■"/>
+      <w:lvlText w:val="-"/>
       <w:lvlJc w:val="left"/>
       <w:pPr>
         <w:ind w:left="4320" w:hanging="360"/>
@@ -3822,7 +4698,7 @@
     <w:lvl w:ilvl="6">
       <w:start w:val="1"/>
       <w:numFmt w:val="bullet"/>
-      <w:lvlText w:val="●"/>
+      <w:lvlText w:val="-"/>
       <w:lvlJc w:val="left"/>
       <w:pPr>
         <w:ind w:left="5040" w:hanging="360"/>
@@ -3834,7 +4710,7 @@
     <w:lvl w:ilvl="7">
       <w:start w:val="1"/>
       <w:numFmt w:val="bullet"/>
-      <w:lvlText w:val="○"/>
+      <w:lvlText w:val="-"/>
       <w:lvlJc w:val="left"/>
       <w:pPr>
         <w:ind w:left="5760" w:hanging="360"/>
@@ -3846,7 +4722,7 @@
     <w:lvl w:ilvl="8">
       <w:start w:val="1"/>
       <w:numFmt w:val="bullet"/>
-      <w:lvlText w:val="■"/>
+      <w:lvlText w:val="-"/>
       <w:lvlJc w:val="left"/>
       <w:pPr>
         <w:ind w:left="6480" w:hanging="360"/>
@@ -3860,7 +4736,7 @@
     <w:lvl w:ilvl="0">
       <w:start w:val="1"/>
       <w:numFmt w:val="bullet"/>
-      <w:lvlText w:val="-"/>
+      <w:lvlText w:val="●"/>
       <w:lvlJc w:val="left"/>
       <w:pPr>
         <w:ind w:left="720" w:hanging="360"/>
@@ -3872,7 +4748,7 @@
     <w:lvl w:ilvl="1">
       <w:start w:val="1"/>
       <w:numFmt w:val="bullet"/>
-      <w:lvlText w:val="-"/>
+      <w:lvlText w:val="○"/>
       <w:lvlJc w:val="left"/>
       <w:pPr>
         <w:ind w:left="1440" w:hanging="360"/>
@@ -3884,7 +4760,7 @@
     <w:lvl w:ilvl="2">
       <w:start w:val="1"/>
       <w:numFmt w:val="bullet"/>
-      <w:lvlText w:val="-"/>
+      <w:lvlText w:val="■"/>
       <w:lvlJc w:val="left"/>
       <w:pPr>
         <w:ind w:left="2160" w:hanging="360"/>
@@ -3896,7 +4772,7 @@
     <w:lvl w:ilvl="3">
       <w:start w:val="1"/>
       <w:numFmt w:val="bullet"/>
-      <w:lvlText w:val="-"/>
+      <w:lvlText w:val="●"/>
       <w:lvlJc w:val="left"/>
       <w:pPr>
         <w:ind w:left="2880" w:hanging="360"/>
@@ -3908,7 +4784,7 @@
     <w:lvl w:ilvl="4">
       <w:start w:val="1"/>
       <w:numFmt w:val="bullet"/>
-      <w:lvlText w:val="-"/>
+      <w:lvlText w:val="○"/>
       <w:lvlJc w:val="left"/>
       <w:pPr>
         <w:ind w:left="3600" w:hanging="360"/>
@@ -3920,7 +4796,7 @@
     <w:lvl w:ilvl="5">
       <w:start w:val="1"/>
       <w:numFmt w:val="bullet"/>
-      <w:lvlText w:val="-"/>
+      <w:lvlText w:val="■"/>
       <w:lvlJc w:val="left"/>
       <w:pPr>
         <w:ind w:left="4320" w:hanging="360"/>
@@ -3932,7 +4808,7 @@
     <w:lvl w:ilvl="6">
       <w:start w:val="1"/>
       <w:numFmt w:val="bullet"/>
-      <w:lvlText w:val="-"/>
+      <w:lvlText w:val="●"/>
       <w:lvlJc w:val="left"/>
       <w:pPr>
         <w:ind w:left="5040" w:hanging="360"/>
@@ -3944,7 +4820,7 @@
     <w:lvl w:ilvl="7">
       <w:start w:val="1"/>
       <w:numFmt w:val="bullet"/>
-      <w:lvlText w:val="-"/>
+      <w:lvlText w:val="○"/>
       <w:lvlJc w:val="left"/>
       <w:pPr>
         <w:ind w:left="5760" w:hanging="360"/>
@@ -3956,7 +4832,7 @@
     <w:lvl w:ilvl="8">
       <w:start w:val="1"/>
       <w:numFmt w:val="bullet"/>
-      <w:lvlText w:val="-"/>
+      <w:lvlText w:val="■"/>
       <w:lvlJc w:val="left"/>
       <w:pPr>
         <w:ind w:left="6480" w:hanging="360"/>
@@ -4080,7 +4956,7 @@
     <w:lvl w:ilvl="0">
       <w:start w:val="1"/>
       <w:numFmt w:val="bullet"/>
-      <w:lvlText w:val="●"/>
+      <w:lvlText w:val="-"/>
       <w:lvlJc w:val="left"/>
       <w:pPr>
         <w:ind w:left="720" w:hanging="360"/>
@@ -4092,7 +4968,7 @@
     <w:lvl w:ilvl="1">
       <w:start w:val="1"/>
       <w:numFmt w:val="bullet"/>
-      <w:lvlText w:val="○"/>
+      <w:lvlText w:val="-"/>
       <w:lvlJc w:val="left"/>
       <w:pPr>
         <w:ind w:left="1440" w:hanging="360"/>
@@ -4104,7 +4980,7 @@
     <w:lvl w:ilvl="2">
       <w:start w:val="1"/>
       <w:numFmt w:val="bullet"/>
-      <w:lvlText w:val="■"/>
+      <w:lvlText w:val="-"/>
       <w:lvlJc w:val="left"/>
       <w:pPr>
         <w:ind w:left="2160" w:hanging="360"/>
@@ -4116,7 +4992,7 @@
     <w:lvl w:ilvl="3">
       <w:start w:val="1"/>
       <w:numFmt w:val="bullet"/>
-      <w:lvlText w:val="●"/>
+      <w:lvlText w:val="-"/>
       <w:lvlJc w:val="left"/>
       <w:pPr>
         <w:ind w:left="2880" w:hanging="360"/>
@@ -4128,7 +5004,7 @@
     <w:lvl w:ilvl="4">
       <w:start w:val="1"/>
       <w:numFmt w:val="bullet"/>
-      <w:lvlText w:val="○"/>
+      <w:lvlText w:val="-"/>
       <w:lvlJc w:val="left"/>
       <w:pPr>
         <w:ind w:left="3600" w:hanging="360"/>
@@ -4140,7 +5016,7 @@
     <w:lvl w:ilvl="5">
       <w:start w:val="1"/>
       <w:numFmt w:val="bullet"/>
-      <w:lvlText w:val="■"/>
+      <w:lvlText w:val="-"/>
       <w:lvlJc w:val="left"/>
       <w:pPr>
         <w:ind w:left="4320" w:hanging="360"/>
@@ -4152,7 +5028,7 @@
     <w:lvl w:ilvl="6">
       <w:start w:val="1"/>
       <w:numFmt w:val="bullet"/>
-      <w:lvlText w:val="●"/>
+      <w:lvlText w:val="-"/>
       <w:lvlJc w:val="left"/>
       <w:pPr>
         <w:ind w:left="5040" w:hanging="360"/>
@@ -4164,7 +5040,7 @@
     <w:lvl w:ilvl="7">
       <w:start w:val="1"/>
       <w:numFmt w:val="bullet"/>
-      <w:lvlText w:val="○"/>
+      <w:lvlText w:val="-"/>
       <w:lvlJc w:val="left"/>
       <w:pPr>
         <w:ind w:left="5760" w:hanging="360"/>
@@ -4176,7 +5052,7 @@
     <w:lvl w:ilvl="8">
       <w:start w:val="1"/>
       <w:numFmt w:val="bullet"/>
-      <w:lvlText w:val="■"/>
+      <w:lvlText w:val="-"/>
       <w:lvlJc w:val="left"/>
       <w:pPr>
         <w:ind w:left="6480" w:hanging="360"/>
@@ -4299,6 +5175,556 @@
   <w:abstractNum w:abstractNumId="14">
     <w:lvl w:ilvl="0">
       <w:start w:val="1"/>
+      <w:numFmt w:val="bullet"/>
+      <w:lvlText w:val="-"/>
+      <w:lvlJc w:val="left"/>
+      <w:pPr>
+        <w:ind w:left="720" w:hanging="360"/>
+      </w:pPr>
+      <w:rPr>
+        <w:u w:val="none"/>
+      </w:rPr>
+    </w:lvl>
+    <w:lvl w:ilvl="1">
+      <w:start w:val="1"/>
+      <w:numFmt w:val="bullet"/>
+      <w:lvlText w:val="-"/>
+      <w:lvlJc w:val="left"/>
+      <w:pPr>
+        <w:ind w:left="1440" w:hanging="360"/>
+      </w:pPr>
+      <w:rPr>
+        <w:u w:val="none"/>
+      </w:rPr>
+    </w:lvl>
+    <w:lvl w:ilvl="2">
+      <w:start w:val="1"/>
+      <w:numFmt w:val="bullet"/>
+      <w:lvlText w:val="-"/>
+      <w:lvlJc w:val="left"/>
+      <w:pPr>
+        <w:ind w:left="2160" w:hanging="360"/>
+      </w:pPr>
+      <w:rPr>
+        <w:u w:val="none"/>
+      </w:rPr>
+    </w:lvl>
+    <w:lvl w:ilvl="3">
+      <w:start w:val="1"/>
+      <w:numFmt w:val="bullet"/>
+      <w:lvlText w:val="-"/>
+      <w:lvlJc w:val="left"/>
+      <w:pPr>
+        <w:ind w:left="2880" w:hanging="360"/>
+      </w:pPr>
+      <w:rPr>
+        <w:u w:val="none"/>
+      </w:rPr>
+    </w:lvl>
+    <w:lvl w:ilvl="4">
+      <w:start w:val="1"/>
+      <w:numFmt w:val="bullet"/>
+      <w:lvlText w:val="-"/>
+      <w:lvlJc w:val="left"/>
+      <w:pPr>
+        <w:ind w:left="3600" w:hanging="360"/>
+      </w:pPr>
+      <w:rPr>
+        <w:u w:val="none"/>
+      </w:rPr>
+    </w:lvl>
+    <w:lvl w:ilvl="5">
+      <w:start w:val="1"/>
+      <w:numFmt w:val="bullet"/>
+      <w:lvlText w:val="-"/>
+      <w:lvlJc w:val="left"/>
+      <w:pPr>
+        <w:ind w:left="4320" w:hanging="360"/>
+      </w:pPr>
+      <w:rPr>
+        <w:u w:val="none"/>
+      </w:rPr>
+    </w:lvl>
+    <w:lvl w:ilvl="6">
+      <w:start w:val="1"/>
+      <w:numFmt w:val="bullet"/>
+      <w:lvlText w:val="-"/>
+      <w:lvlJc w:val="left"/>
+      <w:pPr>
+        <w:ind w:left="5040" w:hanging="360"/>
+      </w:pPr>
+      <w:rPr>
+        <w:u w:val="none"/>
+      </w:rPr>
+    </w:lvl>
+    <w:lvl w:ilvl="7">
+      <w:start w:val="1"/>
+      <w:numFmt w:val="bullet"/>
+      <w:lvlText w:val="-"/>
+      <w:lvlJc w:val="left"/>
+      <w:pPr>
+        <w:ind w:left="5760" w:hanging="360"/>
+      </w:pPr>
+      <w:rPr>
+        <w:u w:val="none"/>
+      </w:rPr>
+    </w:lvl>
+    <w:lvl w:ilvl="8">
+      <w:start w:val="1"/>
+      <w:numFmt w:val="bullet"/>
+      <w:lvlText w:val="-"/>
+      <w:lvlJc w:val="left"/>
+      <w:pPr>
+        <w:ind w:left="6480" w:hanging="360"/>
+      </w:pPr>
+      <w:rPr>
+        <w:u w:val="none"/>
+      </w:rPr>
+    </w:lvl>
+  </w:abstractNum>
+  <w:abstractNum w:abstractNumId="15">
+    <w:lvl w:ilvl="0">
+      <w:start w:val="1"/>
+      <w:numFmt w:val="bullet"/>
+      <w:lvlText w:val="●"/>
+      <w:lvlJc w:val="left"/>
+      <w:pPr>
+        <w:ind w:left="720" w:hanging="360"/>
+      </w:pPr>
+      <w:rPr>
+        <w:u w:val="none"/>
+      </w:rPr>
+    </w:lvl>
+    <w:lvl w:ilvl="1">
+      <w:start w:val="1"/>
+      <w:numFmt w:val="bullet"/>
+      <w:lvlText w:val="○"/>
+      <w:lvlJc w:val="left"/>
+      <w:pPr>
+        <w:ind w:left="1440" w:hanging="360"/>
+      </w:pPr>
+      <w:rPr>
+        <w:u w:val="none"/>
+      </w:rPr>
+    </w:lvl>
+    <w:lvl w:ilvl="2">
+      <w:start w:val="1"/>
+      <w:numFmt w:val="bullet"/>
+      <w:lvlText w:val="■"/>
+      <w:lvlJc w:val="left"/>
+      <w:pPr>
+        <w:ind w:left="2160" w:hanging="360"/>
+      </w:pPr>
+      <w:rPr>
+        <w:u w:val="none"/>
+      </w:rPr>
+    </w:lvl>
+    <w:lvl w:ilvl="3">
+      <w:start w:val="1"/>
+      <w:numFmt w:val="bullet"/>
+      <w:lvlText w:val="●"/>
+      <w:lvlJc w:val="left"/>
+      <w:pPr>
+        <w:ind w:left="2880" w:hanging="360"/>
+      </w:pPr>
+      <w:rPr>
+        <w:u w:val="none"/>
+      </w:rPr>
+    </w:lvl>
+    <w:lvl w:ilvl="4">
+      <w:start w:val="1"/>
+      <w:numFmt w:val="bullet"/>
+      <w:lvlText w:val="○"/>
+      <w:lvlJc w:val="left"/>
+      <w:pPr>
+        <w:ind w:left="3600" w:hanging="360"/>
+      </w:pPr>
+      <w:rPr>
+        <w:u w:val="none"/>
+      </w:rPr>
+    </w:lvl>
+    <w:lvl w:ilvl="5">
+      <w:start w:val="1"/>
+      <w:numFmt w:val="bullet"/>
+      <w:lvlText w:val="■"/>
+      <w:lvlJc w:val="left"/>
+      <w:pPr>
+        <w:ind w:left="4320" w:hanging="360"/>
+      </w:pPr>
+      <w:rPr>
+        <w:u w:val="none"/>
+      </w:rPr>
+    </w:lvl>
+    <w:lvl w:ilvl="6">
+      <w:start w:val="1"/>
+      <w:numFmt w:val="bullet"/>
+      <w:lvlText w:val="●"/>
+      <w:lvlJc w:val="left"/>
+      <w:pPr>
+        <w:ind w:left="5040" w:hanging="360"/>
+      </w:pPr>
+      <w:rPr>
+        <w:u w:val="none"/>
+      </w:rPr>
+    </w:lvl>
+    <w:lvl w:ilvl="7">
+      <w:start w:val="1"/>
+      <w:numFmt w:val="bullet"/>
+      <w:lvlText w:val="○"/>
+      <w:lvlJc w:val="left"/>
+      <w:pPr>
+        <w:ind w:left="5760" w:hanging="360"/>
+      </w:pPr>
+      <w:rPr>
+        <w:u w:val="none"/>
+      </w:rPr>
+    </w:lvl>
+    <w:lvl w:ilvl="8">
+      <w:start w:val="1"/>
+      <w:numFmt w:val="bullet"/>
+      <w:lvlText w:val="■"/>
+      <w:lvlJc w:val="left"/>
+      <w:pPr>
+        <w:ind w:left="6480" w:hanging="360"/>
+      </w:pPr>
+      <w:rPr>
+        <w:u w:val="none"/>
+      </w:rPr>
+    </w:lvl>
+  </w:abstractNum>
+  <w:abstractNum w:abstractNumId="16">
+    <w:lvl w:ilvl="0">
+      <w:start w:val="1"/>
+      <w:numFmt w:val="bullet"/>
+      <w:lvlText w:val="●"/>
+      <w:lvlJc w:val="left"/>
+      <w:pPr>
+        <w:ind w:left="720" w:hanging="360"/>
+      </w:pPr>
+      <w:rPr>
+        <w:u w:val="none"/>
+      </w:rPr>
+    </w:lvl>
+    <w:lvl w:ilvl="1">
+      <w:start w:val="1"/>
+      <w:numFmt w:val="bullet"/>
+      <w:lvlText w:val="○"/>
+      <w:lvlJc w:val="left"/>
+      <w:pPr>
+        <w:ind w:left="1440" w:hanging="360"/>
+      </w:pPr>
+      <w:rPr>
+        <w:u w:val="none"/>
+      </w:rPr>
+    </w:lvl>
+    <w:lvl w:ilvl="2">
+      <w:start w:val="1"/>
+      <w:numFmt w:val="bullet"/>
+      <w:lvlText w:val="■"/>
+      <w:lvlJc w:val="left"/>
+      <w:pPr>
+        <w:ind w:left="2160" w:hanging="360"/>
+      </w:pPr>
+      <w:rPr>
+        <w:u w:val="none"/>
+      </w:rPr>
+    </w:lvl>
+    <w:lvl w:ilvl="3">
+      <w:start w:val="1"/>
+      <w:numFmt w:val="bullet"/>
+      <w:lvlText w:val="●"/>
+      <w:lvlJc w:val="left"/>
+      <w:pPr>
+        <w:ind w:left="2880" w:hanging="360"/>
+      </w:pPr>
+      <w:rPr>
+        <w:u w:val="none"/>
+      </w:rPr>
+    </w:lvl>
+    <w:lvl w:ilvl="4">
+      <w:start w:val="1"/>
+      <w:numFmt w:val="bullet"/>
+      <w:lvlText w:val="○"/>
+      <w:lvlJc w:val="left"/>
+      <w:pPr>
+        <w:ind w:left="3600" w:hanging="360"/>
+      </w:pPr>
+      <w:rPr>
+        <w:u w:val="none"/>
+      </w:rPr>
+    </w:lvl>
+    <w:lvl w:ilvl="5">
+      <w:start w:val="1"/>
+      <w:numFmt w:val="bullet"/>
+      <w:lvlText w:val="■"/>
+      <w:lvlJc w:val="left"/>
+      <w:pPr>
+        <w:ind w:left="4320" w:hanging="360"/>
+      </w:pPr>
+      <w:rPr>
+        <w:u w:val="none"/>
+      </w:rPr>
+    </w:lvl>
+    <w:lvl w:ilvl="6">
+      <w:start w:val="1"/>
+      <w:numFmt w:val="bullet"/>
+      <w:lvlText w:val="●"/>
+      <w:lvlJc w:val="left"/>
+      <w:pPr>
+        <w:ind w:left="5040" w:hanging="360"/>
+      </w:pPr>
+      <w:rPr>
+        <w:u w:val="none"/>
+      </w:rPr>
+    </w:lvl>
+    <w:lvl w:ilvl="7">
+      <w:start w:val="1"/>
+      <w:numFmt w:val="bullet"/>
+      <w:lvlText w:val="○"/>
+      <w:lvlJc w:val="left"/>
+      <w:pPr>
+        <w:ind w:left="5760" w:hanging="360"/>
+      </w:pPr>
+      <w:rPr>
+        <w:u w:val="none"/>
+      </w:rPr>
+    </w:lvl>
+    <w:lvl w:ilvl="8">
+      <w:start w:val="1"/>
+      <w:numFmt w:val="bullet"/>
+      <w:lvlText w:val="■"/>
+      <w:lvlJc w:val="left"/>
+      <w:pPr>
+        <w:ind w:left="6480" w:hanging="360"/>
+      </w:pPr>
+      <w:rPr>
+        <w:u w:val="none"/>
+      </w:rPr>
+    </w:lvl>
+  </w:abstractNum>
+  <w:abstractNum w:abstractNumId="17">
+    <w:lvl w:ilvl="0">
+      <w:start w:val="1"/>
+      <w:numFmt w:val="bullet"/>
+      <w:lvlText w:val="-"/>
+      <w:lvlJc w:val="left"/>
+      <w:pPr>
+        <w:ind w:left="720" w:hanging="360"/>
+      </w:pPr>
+      <w:rPr>
+        <w:u w:val="none"/>
+      </w:rPr>
+    </w:lvl>
+    <w:lvl w:ilvl="1">
+      <w:start w:val="1"/>
+      <w:numFmt w:val="bullet"/>
+      <w:lvlText w:val="-"/>
+      <w:lvlJc w:val="left"/>
+      <w:pPr>
+        <w:ind w:left="1440" w:hanging="360"/>
+      </w:pPr>
+      <w:rPr>
+        <w:u w:val="none"/>
+      </w:rPr>
+    </w:lvl>
+    <w:lvl w:ilvl="2">
+      <w:start w:val="1"/>
+      <w:numFmt w:val="bullet"/>
+      <w:lvlText w:val="-"/>
+      <w:lvlJc w:val="left"/>
+      <w:pPr>
+        <w:ind w:left="2160" w:hanging="360"/>
+      </w:pPr>
+      <w:rPr>
+        <w:u w:val="none"/>
+      </w:rPr>
+    </w:lvl>
+    <w:lvl w:ilvl="3">
+      <w:start w:val="1"/>
+      <w:numFmt w:val="bullet"/>
+      <w:lvlText w:val="-"/>
+      <w:lvlJc w:val="left"/>
+      <w:pPr>
+        <w:ind w:left="2880" w:hanging="360"/>
+      </w:pPr>
+      <w:rPr>
+        <w:u w:val="none"/>
+      </w:rPr>
+    </w:lvl>
+    <w:lvl w:ilvl="4">
+      <w:start w:val="1"/>
+      <w:numFmt w:val="bullet"/>
+      <w:lvlText w:val="-"/>
+      <w:lvlJc w:val="left"/>
+      <w:pPr>
+        <w:ind w:left="3600" w:hanging="360"/>
+      </w:pPr>
+      <w:rPr>
+        <w:u w:val="none"/>
+      </w:rPr>
+    </w:lvl>
+    <w:lvl w:ilvl="5">
+      <w:start w:val="1"/>
+      <w:numFmt w:val="bullet"/>
+      <w:lvlText w:val="-"/>
+      <w:lvlJc w:val="left"/>
+      <w:pPr>
+        <w:ind w:left="4320" w:hanging="360"/>
+      </w:pPr>
+      <w:rPr>
+        <w:u w:val="none"/>
+      </w:rPr>
+    </w:lvl>
+    <w:lvl w:ilvl="6">
+      <w:start w:val="1"/>
+      <w:numFmt w:val="bullet"/>
+      <w:lvlText w:val="-"/>
+      <w:lvlJc w:val="left"/>
+      <w:pPr>
+        <w:ind w:left="5040" w:hanging="360"/>
+      </w:pPr>
+      <w:rPr>
+        <w:u w:val="none"/>
+      </w:rPr>
+    </w:lvl>
+    <w:lvl w:ilvl="7">
+      <w:start w:val="1"/>
+      <w:numFmt w:val="bullet"/>
+      <w:lvlText w:val="-"/>
+      <w:lvlJc w:val="left"/>
+      <w:pPr>
+        <w:ind w:left="5760" w:hanging="360"/>
+      </w:pPr>
+      <w:rPr>
+        <w:u w:val="none"/>
+      </w:rPr>
+    </w:lvl>
+    <w:lvl w:ilvl="8">
+      <w:start w:val="1"/>
+      <w:numFmt w:val="bullet"/>
+      <w:lvlText w:val="-"/>
+      <w:lvlJc w:val="left"/>
+      <w:pPr>
+        <w:ind w:left="6480" w:hanging="360"/>
+      </w:pPr>
+      <w:rPr>
+        <w:u w:val="none"/>
+      </w:rPr>
+    </w:lvl>
+  </w:abstractNum>
+  <w:abstractNum w:abstractNumId="18">
+    <w:lvl w:ilvl="0">
+      <w:start w:val="1"/>
+      <w:numFmt w:val="bullet"/>
+      <w:lvlText w:val="●"/>
+      <w:lvlJc w:val="left"/>
+      <w:pPr>
+        <w:ind w:left="720" w:hanging="360"/>
+      </w:pPr>
+      <w:rPr>
+        <w:u w:val="none"/>
+      </w:rPr>
+    </w:lvl>
+    <w:lvl w:ilvl="1">
+      <w:start w:val="1"/>
+      <w:numFmt w:val="bullet"/>
+      <w:lvlText w:val="○"/>
+      <w:lvlJc w:val="left"/>
+      <w:pPr>
+        <w:ind w:left="1440" w:hanging="360"/>
+      </w:pPr>
+      <w:rPr>
+        <w:u w:val="none"/>
+      </w:rPr>
+    </w:lvl>
+    <w:lvl w:ilvl="2">
+      <w:start w:val="1"/>
+      <w:numFmt w:val="bullet"/>
+      <w:lvlText w:val="■"/>
+      <w:lvlJc w:val="left"/>
+      <w:pPr>
+        <w:ind w:left="2160" w:hanging="360"/>
+      </w:pPr>
+      <w:rPr>
+        <w:u w:val="none"/>
+      </w:rPr>
+    </w:lvl>
+    <w:lvl w:ilvl="3">
+      <w:start w:val="1"/>
+      <w:numFmt w:val="bullet"/>
+      <w:lvlText w:val="●"/>
+      <w:lvlJc w:val="left"/>
+      <w:pPr>
+        <w:ind w:left="2880" w:hanging="360"/>
+      </w:pPr>
+      <w:rPr>
+        <w:u w:val="none"/>
+      </w:rPr>
+    </w:lvl>
+    <w:lvl w:ilvl="4">
+      <w:start w:val="1"/>
+      <w:numFmt w:val="bullet"/>
+      <w:lvlText w:val="○"/>
+      <w:lvlJc w:val="left"/>
+      <w:pPr>
+        <w:ind w:left="3600" w:hanging="360"/>
+      </w:pPr>
+      <w:rPr>
+        <w:u w:val="none"/>
+      </w:rPr>
+    </w:lvl>
+    <w:lvl w:ilvl="5">
+      <w:start w:val="1"/>
+      <w:numFmt w:val="bullet"/>
+      <w:lvlText w:val="■"/>
+      <w:lvlJc w:val="left"/>
+      <w:pPr>
+        <w:ind w:left="4320" w:hanging="360"/>
+      </w:pPr>
+      <w:rPr>
+        <w:u w:val="none"/>
+      </w:rPr>
+    </w:lvl>
+    <w:lvl w:ilvl="6">
+      <w:start w:val="1"/>
+      <w:numFmt w:val="bullet"/>
+      <w:lvlText w:val="●"/>
+      <w:lvlJc w:val="left"/>
+      <w:pPr>
+        <w:ind w:left="5040" w:hanging="360"/>
+      </w:pPr>
+      <w:rPr>
+        <w:u w:val="none"/>
+      </w:rPr>
+    </w:lvl>
+    <w:lvl w:ilvl="7">
+      <w:start w:val="1"/>
+      <w:numFmt w:val="bullet"/>
+      <w:lvlText w:val="○"/>
+      <w:lvlJc w:val="left"/>
+      <w:pPr>
+        <w:ind w:left="5760" w:hanging="360"/>
+      </w:pPr>
+      <w:rPr>
+        <w:u w:val="none"/>
+      </w:rPr>
+    </w:lvl>
+    <w:lvl w:ilvl="8">
+      <w:start w:val="1"/>
+      <w:numFmt w:val="bullet"/>
+      <w:lvlText w:val="■"/>
+      <w:lvlJc w:val="left"/>
+      <w:pPr>
+        <w:ind w:left="6480" w:hanging="360"/>
+      </w:pPr>
+      <w:rPr>
+        <w:u w:val="none"/>
+      </w:rPr>
+    </w:lvl>
+  </w:abstractNum>
+  <w:abstractNum w:abstractNumId="19">
+    <w:lvl w:ilvl="0">
+      <w:start w:val="1"/>
       <w:numFmt w:val="decimal"/>
       <w:lvlText w:val="%1."/>
       <w:lvlJc w:val="left"/>
@@ -4406,7 +5832,7 @@
       </w:rPr>
     </w:lvl>
   </w:abstractNum>
-  <w:abstractNum w:abstractNumId="15">
+  <w:abstractNum w:abstractNumId="20">
     <w:lvl w:ilvl="0">
       <w:start w:val="1"/>
       <w:numFmt w:val="bullet"/>
@@ -4516,7 +5942,7 @@
       </w:rPr>
     </w:lvl>
   </w:abstractNum>
-  <w:abstractNum w:abstractNumId="16">
+  <w:abstractNum w:abstractNumId="21">
     <w:lvl w:ilvl="0">
       <w:start w:val="1"/>
       <w:numFmt w:val="bullet"/>
@@ -4626,10 +6052,120 @@
       </w:rPr>
     </w:lvl>
   </w:abstractNum>
-  <w:abstractNum w:abstractNumId="17">
+  <w:abstractNum w:abstractNumId="22">
     <w:lvl w:ilvl="0">
       <w:start w:val="1"/>
       <w:numFmt w:val="bullet"/>
+      <w:lvlText w:val="-"/>
+      <w:lvlJc w:val="left"/>
+      <w:pPr>
+        <w:ind w:left="720" w:hanging="360"/>
+      </w:pPr>
+      <w:rPr>
+        <w:u w:val="none"/>
+      </w:rPr>
+    </w:lvl>
+    <w:lvl w:ilvl="1">
+      <w:start w:val="1"/>
+      <w:numFmt w:val="bullet"/>
+      <w:lvlText w:val="-"/>
+      <w:lvlJc w:val="left"/>
+      <w:pPr>
+        <w:ind w:left="1440" w:hanging="360"/>
+      </w:pPr>
+      <w:rPr>
+        <w:u w:val="none"/>
+      </w:rPr>
+    </w:lvl>
+    <w:lvl w:ilvl="2">
+      <w:start w:val="1"/>
+      <w:numFmt w:val="bullet"/>
+      <w:lvlText w:val="-"/>
+      <w:lvlJc w:val="left"/>
+      <w:pPr>
+        <w:ind w:left="2160" w:hanging="360"/>
+      </w:pPr>
+      <w:rPr>
+        <w:u w:val="none"/>
+      </w:rPr>
+    </w:lvl>
+    <w:lvl w:ilvl="3">
+      <w:start w:val="1"/>
+      <w:numFmt w:val="bullet"/>
+      <w:lvlText w:val="-"/>
+      <w:lvlJc w:val="left"/>
+      <w:pPr>
+        <w:ind w:left="2880" w:hanging="360"/>
+      </w:pPr>
+      <w:rPr>
+        <w:u w:val="none"/>
+      </w:rPr>
+    </w:lvl>
+    <w:lvl w:ilvl="4">
+      <w:start w:val="1"/>
+      <w:numFmt w:val="bullet"/>
+      <w:lvlText w:val="-"/>
+      <w:lvlJc w:val="left"/>
+      <w:pPr>
+        <w:ind w:left="3600" w:hanging="360"/>
+      </w:pPr>
+      <w:rPr>
+        <w:u w:val="none"/>
+      </w:rPr>
+    </w:lvl>
+    <w:lvl w:ilvl="5">
+      <w:start w:val="1"/>
+      <w:numFmt w:val="bullet"/>
+      <w:lvlText w:val="-"/>
+      <w:lvlJc w:val="left"/>
+      <w:pPr>
+        <w:ind w:left="4320" w:hanging="360"/>
+      </w:pPr>
+      <w:rPr>
+        <w:u w:val="none"/>
+      </w:rPr>
+    </w:lvl>
+    <w:lvl w:ilvl="6">
+      <w:start w:val="1"/>
+      <w:numFmt w:val="bullet"/>
+      <w:lvlText w:val="-"/>
+      <w:lvlJc w:val="left"/>
+      <w:pPr>
+        <w:ind w:left="5040" w:hanging="360"/>
+      </w:pPr>
+      <w:rPr>
+        <w:u w:val="none"/>
+      </w:rPr>
+    </w:lvl>
+    <w:lvl w:ilvl="7">
+      <w:start w:val="1"/>
+      <w:numFmt w:val="bullet"/>
+      <w:lvlText w:val="-"/>
+      <w:lvlJc w:val="left"/>
+      <w:pPr>
+        <w:ind w:left="5760" w:hanging="360"/>
+      </w:pPr>
+      <w:rPr>
+        <w:u w:val="none"/>
+      </w:rPr>
+    </w:lvl>
+    <w:lvl w:ilvl="8">
+      <w:start w:val="1"/>
+      <w:numFmt w:val="bullet"/>
+      <w:lvlText w:val="-"/>
+      <w:lvlJc w:val="left"/>
+      <w:pPr>
+        <w:ind w:left="6480" w:hanging="360"/>
+      </w:pPr>
+      <w:rPr>
+        <w:u w:val="none"/>
+      </w:rPr>
+    </w:lvl>
+  </w:abstractNum>
+  <w:abstractNum w:abstractNumId="23">
+    <w:lvl w:ilvl="0">
+      <w:start w:val="1"/>
+      <w:numFmt w:val="bullet"/>
       <w:lvlText w:val="●"/>
       <w:lvlJc w:val="left"/>
       <w:pPr>
@@ -4736,10 +6272,120 @@
       </w:rPr>
     </w:lvl>
   </w:abstractNum>
-  <w:abstractNum w:abstractNumId="18">
+  <w:abstractNum w:abstractNumId="24">
     <w:lvl w:ilvl="0">
       <w:start w:val="1"/>
       <w:numFmt w:val="bullet"/>
+      <w:lvlText w:val="-"/>
+      <w:lvlJc w:val="left"/>
+      <w:pPr>
+        <w:ind w:left="720" w:hanging="360"/>
+      </w:pPr>
+      <w:rPr>
+        <w:u w:val="none"/>
+      </w:rPr>
+    </w:lvl>
+    <w:lvl w:ilvl="1">
+      <w:start w:val="1"/>
+      <w:numFmt w:val="bullet"/>
+      <w:lvlText w:val="-"/>
+      <w:lvlJc w:val="left"/>
+      <w:pPr>
+        <w:ind w:left="1440" w:hanging="360"/>
+      </w:pPr>
+      <w:rPr>
+        <w:u w:val="none"/>
+      </w:rPr>
+    </w:lvl>
+    <w:lvl w:ilvl="2">
+      <w:start w:val="1"/>
+      <w:numFmt w:val="bullet"/>
+      <w:lvlText w:val="-"/>
+      <w:lvlJc w:val="left"/>
+      <w:pPr>
+        <w:ind w:left="2160" w:hanging="360"/>
+      </w:pPr>
+      <w:rPr>
+        <w:u w:val="none"/>
+      </w:rPr>
+    </w:lvl>
+    <w:lvl w:ilvl="3">
+      <w:start w:val="1"/>
+      <w:numFmt w:val="bullet"/>
+      <w:lvlText w:val="-"/>
+      <w:lvlJc w:val="left"/>
+      <w:pPr>
+        <w:ind w:left="2880" w:hanging="360"/>
+      </w:pPr>
+      <w:rPr>
+        <w:u w:val="none"/>
+      </w:rPr>
+    </w:lvl>
+    <w:lvl w:ilvl="4">
+      <w:start w:val="1"/>
+      <w:numFmt w:val="bullet"/>
+      <w:lvlText w:val="-"/>
+      <w:lvlJc w:val="left"/>
+      <w:pPr>
+        <w:ind w:left="3600" w:hanging="360"/>
+      </w:pPr>
+      <w:rPr>
+        <w:u w:val="none"/>
+      </w:rPr>
+    </w:lvl>
+    <w:lvl w:ilvl="5">
+      <w:start w:val="1"/>
+      <w:numFmt w:val="bullet"/>
+      <w:lvlText w:val="-"/>
+      <w:lvlJc w:val="left"/>
+      <w:pPr>
+        <w:ind w:left="4320" w:hanging="360"/>
+      </w:pPr>
+      <w:rPr>
+        <w:u w:val="none"/>
+      </w:rPr>
+    </w:lvl>
+    <w:lvl w:ilvl="6">
+      <w:start w:val="1"/>
+      <w:numFmt w:val="bullet"/>
+      <w:lvlText w:val="-"/>
+      <w:lvlJc w:val="left"/>
+      <w:pPr>
+        <w:ind w:left="5040" w:hanging="360"/>
+      </w:pPr>
+      <w:rPr>
+        <w:u w:val="none"/>
+      </w:rPr>
+    </w:lvl>
+    <w:lvl w:ilvl="7">
+      <w:start w:val="1"/>
+      <w:numFmt w:val="bullet"/>
+      <w:lvlText w:val="-"/>
+      <w:lvlJc w:val="left"/>
+      <w:pPr>
+        <w:ind w:left="5760" w:hanging="360"/>
+      </w:pPr>
+      <w:rPr>
+        <w:u w:val="none"/>
+      </w:rPr>
+    </w:lvl>
+    <w:lvl w:ilvl="8">
+      <w:start w:val="1"/>
+      <w:numFmt w:val="bullet"/>
+      <w:lvlText w:val="-"/>
+      <w:lvlJc w:val="left"/>
+      <w:pPr>
+        <w:ind w:left="6480" w:hanging="360"/>
+      </w:pPr>
+      <w:rPr>
+        <w:u w:val="none"/>
+      </w:rPr>
+    </w:lvl>
+  </w:abstractNum>
+  <w:abstractNum w:abstractNumId="25">
+    <w:lvl w:ilvl="0">
+      <w:start w:val="1"/>
+      <w:numFmt w:val="bullet"/>
       <w:lvlText w:val="●"/>
       <w:lvlJc w:val="left"/>
       <w:pPr>
@@ -4837,6 +6483,116 @@
       <w:start w:val="1"/>
       <w:numFmt w:val="bullet"/>
       <w:lvlText w:val="■"/>
+      <w:lvlJc w:val="left"/>
+      <w:pPr>
+        <w:ind w:left="6480" w:hanging="360"/>
+      </w:pPr>
+      <w:rPr>
+        <w:u w:val="none"/>
+      </w:rPr>
+    </w:lvl>
+  </w:abstractNum>
+  <w:abstractNum w:abstractNumId="26">
+    <w:lvl w:ilvl="0">
+      <w:start w:val="1"/>
+      <w:numFmt w:val="bullet"/>
+      <w:lvlText w:val="-"/>
+      <w:lvlJc w:val="left"/>
+      <w:pPr>
+        <w:ind w:left="720" w:hanging="360"/>
+      </w:pPr>
+      <w:rPr>
+        <w:u w:val="none"/>
+      </w:rPr>
+    </w:lvl>
+    <w:lvl w:ilvl="1">
+      <w:start w:val="1"/>
+      <w:numFmt w:val="bullet"/>
+      <w:lvlText w:val="-"/>
+      <w:lvlJc w:val="left"/>
+      <w:pPr>
+        <w:ind w:left="1440" w:hanging="360"/>
+      </w:pPr>
+      <w:rPr>
+        <w:u w:val="none"/>
+      </w:rPr>
+    </w:lvl>
+    <w:lvl w:ilvl="2">
+      <w:start w:val="1"/>
+      <w:numFmt w:val="bullet"/>
+      <w:lvlText w:val="-"/>
+      <w:lvlJc w:val="left"/>
+      <w:pPr>
+        <w:ind w:left="2160" w:hanging="360"/>
+      </w:pPr>
+      <w:rPr>
+        <w:u w:val="none"/>
+      </w:rPr>
+    </w:lvl>
+    <w:lvl w:ilvl="3">
+      <w:start w:val="1"/>
+      <w:numFmt w:val="bullet"/>
+      <w:lvlText w:val="-"/>
+      <w:lvlJc w:val="left"/>
+      <w:pPr>
+        <w:ind w:left="2880" w:hanging="360"/>
+      </w:pPr>
+      <w:rPr>
+        <w:u w:val="none"/>
+      </w:rPr>
+    </w:lvl>
+    <w:lvl w:ilvl="4">
+      <w:start w:val="1"/>
+      <w:numFmt w:val="bullet"/>
+      <w:lvlText w:val="-"/>
+      <w:lvlJc w:val="left"/>
+      <w:pPr>
+        <w:ind w:left="3600" w:hanging="360"/>
+      </w:pPr>
+      <w:rPr>
+        <w:u w:val="none"/>
+      </w:rPr>
+    </w:lvl>
+    <w:lvl w:ilvl="5">
+      <w:start w:val="1"/>
+      <w:numFmt w:val="bullet"/>
+      <w:lvlText w:val="-"/>
+      <w:lvlJc w:val="left"/>
+      <w:pPr>
+        <w:ind w:left="4320" w:hanging="360"/>
+      </w:pPr>
+      <w:rPr>
+        <w:u w:val="none"/>
+      </w:rPr>
+    </w:lvl>
+    <w:lvl w:ilvl="6">
+      <w:start w:val="1"/>
+      <w:numFmt w:val="bullet"/>
+      <w:lvlText w:val="-"/>
+      <w:lvlJc w:val="left"/>
+      <w:pPr>
+        <w:ind w:left="5040" w:hanging="360"/>
+      </w:pPr>
+      <w:rPr>
+        <w:u w:val="none"/>
+      </w:rPr>
+    </w:lvl>
+    <w:lvl w:ilvl="7">
+      <w:start w:val="1"/>
+      <w:numFmt w:val="bullet"/>
+      <w:lvlText w:val="-"/>
+      <w:lvlJc w:val="left"/>
+      <w:pPr>
+        <w:ind w:left="5760" w:hanging="360"/>
+      </w:pPr>
+      <w:rPr>
+        <w:u w:val="none"/>
+      </w:rPr>
+    </w:lvl>
+    <w:lvl w:ilvl="8">
+      <w:start w:val="1"/>
+      <w:numFmt w:val="bullet"/>
+      <w:lvlText w:val="-"/>
       <w:lvlJc w:val="left"/>
       <w:pPr>
         <w:ind w:left="6480" w:hanging="360"/>
@@ -4899,6 +6655,30 @@
   </w:num>
   <w:num w:numId="18">
     <w:abstractNumId w:val="18"/>
+  </w:num>
+  <w:num w:numId="19">
+    <w:abstractNumId w:val="19"/>
+  </w:num>
+  <w:num w:numId="20">
+    <w:abstractNumId w:val="20"/>
+  </w:num>
+  <w:num w:numId="21">
+    <w:abstractNumId w:val="21"/>
+  </w:num>
+  <w:num w:numId="22">
+    <w:abstractNumId w:val="22"/>
+  </w:num>
+  <w:num w:numId="23">
+    <w:abstractNumId w:val="23"/>
+  </w:num>
+  <w:num w:numId="24">
+    <w:abstractNumId w:val="24"/>
+  </w:num>
+  <w:num w:numId="25">
+    <w:abstractNumId w:val="25"/>
+  </w:num>
+  <w:num w:numId="26">
+    <w:abstractNumId w:val="26"/>
   </w:num>
 </w:numbering>
 </file>

</xml_diff>